<commit_message>
Ay2 Hafta4 raporu güncellendi: Perşembe/Cuma günleri ve Power of Four çözümü eklendi
</commit_message>
<xml_diff>
--- a/ay2/raporlar/Ay2_Hafta4_Rapor.docx
+++ b/ay2/raporlar/Ay2_Hafta4_Rapor.docx
@@ -46,42 +46,55 @@
     <w:p>
       <w:pPr>
         <w:pStyle w:val="Balk1"/>
-        <w:spacing w:before="300" w:after="150"/>
-        <w:rPr>
-          <w:color w:val="0D0D0D" w:themeColor="text1" w:themeTint="F2"/>
-        </w:rPr>
-      </w:pPr>
-      <w:r>
-        <w:rPr>
-          <w:color w:val="0D0D0D" w:themeColor="text1" w:themeTint="F2"/>
+        <w:rPr>
+          <w:color w:val="0D0D0D" w:themeColor="text1" w:themeTint="F2"/>
+          <w:sz w:val="22"/>
+          <w:szCs w:val="22"/>
+        </w:rPr>
+      </w:pPr>
+      <w:r>
+        <w:rPr>
+          <w:color w:val="0D0D0D" w:themeColor="text1" w:themeTint="F2"/>
+          <w:sz w:val="22"/>
+          <w:szCs w:val="22"/>
         </w:rPr>
         <w:t>1. Tamamlanan Görevler</w:t>
       </w:r>
     </w:p>
     <w:p>
       <w:pPr>
-        <w:spacing w:after="100"/>
-        <w:rPr>
-          <w:color w:val="0D0D0D" w:themeColor="text1" w:themeTint="F2"/>
-        </w:rPr>
-      </w:pPr>
-      <w:r>
-        <w:rPr>
-          <w:color w:val="0D0D0D" w:themeColor="text1" w:themeTint="F2"/>
+        <w:pStyle w:val="Balk1"/>
+        <w:spacing w:before="300" w:after="150"/>
+        <w:rPr>
+          <w:color w:val="0D0D0D" w:themeColor="text1" w:themeTint="F2"/>
+          <w:sz w:val="22"/>
+          <w:szCs w:val="22"/>
+        </w:rPr>
+      </w:pPr>
+      <w:r>
+        <w:rPr>
+          <w:color w:val="0D0D0D" w:themeColor="text1" w:themeTint="F2"/>
+          <w:sz w:val="22"/>
+          <w:szCs w:val="22"/>
         </w:rPr>
         <w:t>Pazartesi</w:t>
       </w:r>
     </w:p>
     <w:p>
       <w:pPr>
-        <w:spacing w:after="60"/>
-        <w:rPr>
-          <w:color w:val="0D0D0D" w:themeColor="text1" w:themeTint="F2"/>
-        </w:rPr>
-      </w:pPr>
-      <w:r>
-        <w:rPr>
-          <w:color w:val="0D0D0D" w:themeColor="text1" w:themeTint="F2"/>
+        <w:pStyle w:val="Balk1"/>
+        <w:spacing w:before="300" w:after="150"/>
+        <w:rPr>
+          <w:color w:val="0D0D0D" w:themeColor="text1" w:themeTint="F2"/>
+          <w:sz w:val="22"/>
+          <w:szCs w:val="22"/>
+        </w:rPr>
+      </w:pPr>
+      <w:r>
+        <w:rPr>
+          <w:color w:val="0D0D0D" w:themeColor="text1" w:themeTint="F2"/>
+          <w:sz w:val="22"/>
+          <w:szCs w:val="22"/>
         </w:rPr>
         <w:t xml:space="preserve">- Two </w:t>
       </w:r>
@@ -89,6 +102,8 @@
       <w:r>
         <w:rPr>
           <w:color w:val="0D0D0D" w:themeColor="text1" w:themeTint="F2"/>
+          <w:sz w:val="22"/>
+          <w:szCs w:val="22"/>
         </w:rPr>
         <w:t>Pointers</w:t>
       </w:r>
@@ -96,20 +111,27 @@
       <w:r>
         <w:rPr>
           <w:color w:val="0D0D0D" w:themeColor="text1" w:themeTint="F2"/>
+          <w:sz w:val="22"/>
+          <w:szCs w:val="22"/>
         </w:rPr>
         <w:t xml:space="preserve"> tekniği öğrenildi: bir dizinin iki ucundan başlayıp ortaya doğru ilerleme ve aynı yönde farklı hızlarda ilerleme yaklaşımları kavrandı.</w:t>
       </w:r>
     </w:p>
     <w:p>
       <w:pPr>
-        <w:spacing w:after="60"/>
-        <w:rPr>
-          <w:color w:val="0D0D0D" w:themeColor="text1" w:themeTint="F2"/>
-        </w:rPr>
-      </w:pPr>
-      <w:r>
-        <w:rPr>
-          <w:color w:val="0D0D0D" w:themeColor="text1" w:themeTint="F2"/>
+        <w:pStyle w:val="Balk1"/>
+        <w:spacing w:before="300" w:after="150"/>
+        <w:rPr>
+          <w:color w:val="0D0D0D" w:themeColor="text1" w:themeTint="F2"/>
+          <w:sz w:val="22"/>
+          <w:szCs w:val="22"/>
+        </w:rPr>
+      </w:pPr>
+      <w:r>
+        <w:rPr>
+          <w:color w:val="0D0D0D" w:themeColor="text1" w:themeTint="F2"/>
+          <w:sz w:val="22"/>
+          <w:szCs w:val="22"/>
         </w:rPr>
         <w:t xml:space="preserve">- </w:t>
       </w:r>
@@ -117,6 +139,8 @@
       <w:r>
         <w:rPr>
           <w:color w:val="0D0D0D" w:themeColor="text1" w:themeTint="F2"/>
+          <w:sz w:val="22"/>
+          <w:szCs w:val="22"/>
         </w:rPr>
         <w:t>LeetCode</w:t>
       </w:r>
@@ -124,6 +148,8 @@
       <w:r>
         <w:rPr>
           <w:color w:val="0D0D0D" w:themeColor="text1" w:themeTint="F2"/>
+          <w:sz w:val="22"/>
+          <w:szCs w:val="22"/>
         </w:rPr>
         <w:t xml:space="preserve">: </w:t>
       </w:r>
@@ -131,6 +157,8 @@
       <w:r>
         <w:rPr>
           <w:color w:val="0D0D0D" w:themeColor="text1" w:themeTint="F2"/>
+          <w:sz w:val="22"/>
+          <w:szCs w:val="22"/>
         </w:rPr>
         <w:t>2570 -</w:t>
       </w:r>
@@ -138,6 +166,8 @@
       <w:r>
         <w:rPr>
           <w:color w:val="0D0D0D" w:themeColor="text1" w:themeTint="F2"/>
+          <w:sz w:val="22"/>
+          <w:szCs w:val="22"/>
         </w:rPr>
         <w:t xml:space="preserve"> </w:t>
       </w:r>
@@ -145,6 +175,8 @@
       <w:r>
         <w:rPr>
           <w:color w:val="0D0D0D" w:themeColor="text1" w:themeTint="F2"/>
+          <w:sz w:val="22"/>
+          <w:szCs w:val="22"/>
         </w:rPr>
         <w:t>Merge</w:t>
       </w:r>
@@ -152,6 +184,8 @@
       <w:r>
         <w:rPr>
           <w:color w:val="0D0D0D" w:themeColor="text1" w:themeTint="F2"/>
+          <w:sz w:val="22"/>
+          <w:szCs w:val="22"/>
         </w:rPr>
         <w:t xml:space="preserve"> Two 2D </w:t>
       </w:r>
@@ -159,6 +193,8 @@
       <w:r>
         <w:rPr>
           <w:color w:val="0D0D0D" w:themeColor="text1" w:themeTint="F2"/>
+          <w:sz w:val="22"/>
+          <w:szCs w:val="22"/>
         </w:rPr>
         <w:t>Arrays</w:t>
       </w:r>
@@ -166,6 +202,8 @@
       <w:r>
         <w:rPr>
           <w:color w:val="0D0D0D" w:themeColor="text1" w:themeTint="F2"/>
+          <w:sz w:val="22"/>
+          <w:szCs w:val="22"/>
         </w:rPr>
         <w:t xml:space="preserve"> </w:t>
       </w:r>
@@ -173,6 +211,8 @@
       <w:r>
         <w:rPr>
           <w:color w:val="0D0D0D" w:themeColor="text1" w:themeTint="F2"/>
+          <w:sz w:val="22"/>
+          <w:szCs w:val="22"/>
         </w:rPr>
         <w:t>by</w:t>
       </w:r>
@@ -180,6 +220,8 @@
       <w:r>
         <w:rPr>
           <w:color w:val="0D0D0D" w:themeColor="text1" w:themeTint="F2"/>
+          <w:sz w:val="22"/>
+          <w:szCs w:val="22"/>
         </w:rPr>
         <w:t xml:space="preserve"> </w:t>
       </w:r>
@@ -187,6 +229,8 @@
       <w:r>
         <w:rPr>
           <w:color w:val="0D0D0D" w:themeColor="text1" w:themeTint="F2"/>
+          <w:sz w:val="22"/>
+          <w:szCs w:val="22"/>
         </w:rPr>
         <w:t>Summing</w:t>
       </w:r>
@@ -194,6 +238,8 @@
       <w:r>
         <w:rPr>
           <w:color w:val="0D0D0D" w:themeColor="text1" w:themeTint="F2"/>
+          <w:sz w:val="22"/>
+          <w:szCs w:val="22"/>
         </w:rPr>
         <w:t xml:space="preserve"> </w:t>
       </w:r>
@@ -201,6 +247,8 @@
       <w:r>
         <w:rPr>
           <w:color w:val="0D0D0D" w:themeColor="text1" w:themeTint="F2"/>
+          <w:sz w:val="22"/>
+          <w:szCs w:val="22"/>
         </w:rPr>
         <w:t>Values</w:t>
       </w:r>
@@ -208,6 +256,8 @@
       <w:r>
         <w:rPr>
           <w:color w:val="0D0D0D" w:themeColor="text1" w:themeTint="F2"/>
+          <w:sz w:val="22"/>
+          <w:szCs w:val="22"/>
         </w:rPr>
         <w:t xml:space="preserve"> (</w:t>
       </w:r>
@@ -215,19 +265,17 @@
       <w:r>
         <w:rPr>
           <w:color w:val="0D0D0D" w:themeColor="text1" w:themeTint="F2"/>
-        </w:rPr>
-        <w:t>e</w:t>
-      </w:r>
-      <w:r>
-        <w:rPr>
-          <w:color w:val="0D0D0D" w:themeColor="text1" w:themeTint="F2"/>
-        </w:rPr>
-        <w:t>asy</w:t>
-      </w:r>
-      <w:proofErr w:type="spellEnd"/>
-      <w:r>
-        <w:rPr>
-          <w:color w:val="0D0D0D" w:themeColor="text1" w:themeTint="F2"/>
+          <w:sz w:val="22"/>
+          <w:szCs w:val="22"/>
+        </w:rPr>
+        <w:t>easy</w:t>
+      </w:r>
+      <w:proofErr w:type="spellEnd"/>
+      <w:r>
+        <w:rPr>
+          <w:color w:val="0D0D0D" w:themeColor="text1" w:themeTint="F2"/>
+          <w:sz w:val="22"/>
+          <w:szCs w:val="22"/>
         </w:rPr>
         <w:t xml:space="preserve">) problemi çözüldü, Two </w:t>
       </w:r>
@@ -235,6 +283,8 @@
       <w:r>
         <w:rPr>
           <w:color w:val="0D0D0D" w:themeColor="text1" w:themeTint="F2"/>
+          <w:sz w:val="22"/>
+          <w:szCs w:val="22"/>
         </w:rPr>
         <w:t>Pointers</w:t>
       </w:r>
@@ -242,6 +292,8 @@
       <w:r>
         <w:rPr>
           <w:color w:val="0D0D0D" w:themeColor="text1" w:themeTint="F2"/>
+          <w:sz w:val="22"/>
+          <w:szCs w:val="22"/>
         </w:rPr>
         <w:t xml:space="preserve"> tekniği pratik edildi.</w:t>
       </w:r>
@@ -252,13 +304,1940 @@
         <w:spacing w:before="300" w:after="150"/>
         <w:rPr>
           <w:color w:val="0D0D0D" w:themeColor="text1" w:themeTint="F2"/>
-        </w:rPr>
-      </w:pPr>
-      <w:r>
-        <w:rPr>
-          <w:color w:val="0D0D0D" w:themeColor="text1" w:themeTint="F2"/>
-        </w:rPr>
-        <w:t xml:space="preserve">2. </w:t>
+          <w:sz w:val="22"/>
+          <w:szCs w:val="22"/>
+        </w:rPr>
+      </w:pPr>
+      <w:r>
+        <w:rPr>
+          <w:color w:val="0D0D0D" w:themeColor="text1" w:themeTint="F2"/>
+          <w:sz w:val="22"/>
+          <w:szCs w:val="22"/>
+        </w:rPr>
+        <w:t>Salı</w:t>
+      </w:r>
+    </w:p>
+    <w:p>
+      <w:pPr>
+        <w:pStyle w:val="Balk1"/>
+        <w:spacing w:before="300" w:after="150"/>
+        <w:rPr>
+          <w:color w:val="0D0D0D" w:themeColor="text1" w:themeTint="F2"/>
+          <w:sz w:val="22"/>
+          <w:szCs w:val="22"/>
+        </w:rPr>
+      </w:pPr>
+      <w:r>
+        <w:rPr>
+          <w:color w:val="0D0D0D" w:themeColor="text1" w:themeTint="F2"/>
+          <w:sz w:val="22"/>
+          <w:szCs w:val="22"/>
+        </w:rPr>
+        <w:t xml:space="preserve">- Two </w:t>
+      </w:r>
+      <w:proofErr w:type="spellStart"/>
+      <w:r>
+        <w:rPr>
+          <w:color w:val="0D0D0D" w:themeColor="text1" w:themeTint="F2"/>
+          <w:sz w:val="22"/>
+          <w:szCs w:val="22"/>
+        </w:rPr>
+        <w:t>Pointers</w:t>
+      </w:r>
+      <w:proofErr w:type="spellEnd"/>
+      <w:r>
+        <w:rPr>
+          <w:color w:val="0D0D0D" w:themeColor="text1" w:themeTint="F2"/>
+          <w:sz w:val="22"/>
+          <w:szCs w:val="22"/>
+        </w:rPr>
+        <w:t xml:space="preserve"> tekniği ile sıralı dizilerde ikili toplam (two </w:t>
+      </w:r>
+      <w:proofErr w:type="spellStart"/>
+      <w:r>
+        <w:rPr>
+          <w:color w:val="0D0D0D" w:themeColor="text1" w:themeTint="F2"/>
+          <w:sz w:val="22"/>
+          <w:szCs w:val="22"/>
+        </w:rPr>
+        <w:t>sum</w:t>
+      </w:r>
+      <w:proofErr w:type="spellEnd"/>
+      <w:r>
+        <w:rPr>
+          <w:color w:val="0D0D0D" w:themeColor="text1" w:themeTint="F2"/>
+          <w:sz w:val="22"/>
+          <w:szCs w:val="22"/>
+        </w:rPr>
+        <w:t>) problemleri üzerine pratik yapıldı.</w:t>
+      </w:r>
+    </w:p>
+    <w:p>
+      <w:pPr>
+        <w:pStyle w:val="Balk1"/>
+        <w:spacing w:before="300" w:after="150"/>
+        <w:rPr>
+          <w:color w:val="0D0D0D" w:themeColor="text1" w:themeTint="F2"/>
+          <w:sz w:val="22"/>
+          <w:szCs w:val="22"/>
+        </w:rPr>
+      </w:pPr>
+      <w:r>
+        <w:rPr>
+          <w:color w:val="0D0D0D" w:themeColor="text1" w:themeTint="F2"/>
+          <w:sz w:val="22"/>
+          <w:szCs w:val="22"/>
+        </w:rPr>
+        <w:t xml:space="preserve">- </w:t>
+      </w:r>
+      <w:proofErr w:type="spellStart"/>
+      <w:r>
+        <w:rPr>
+          <w:color w:val="0D0D0D" w:themeColor="text1" w:themeTint="F2"/>
+          <w:sz w:val="22"/>
+          <w:szCs w:val="22"/>
+        </w:rPr>
+        <w:t>LeetCode</w:t>
+      </w:r>
+      <w:proofErr w:type="spellEnd"/>
+      <w:r>
+        <w:rPr>
+          <w:color w:val="0D0D0D" w:themeColor="text1" w:themeTint="F2"/>
+          <w:sz w:val="22"/>
+          <w:szCs w:val="22"/>
+        </w:rPr>
+        <w:t xml:space="preserve">: </w:t>
+      </w:r>
+      <w:proofErr w:type="gramStart"/>
+      <w:r>
+        <w:rPr>
+          <w:color w:val="0D0D0D" w:themeColor="text1" w:themeTint="F2"/>
+          <w:sz w:val="22"/>
+          <w:szCs w:val="22"/>
+        </w:rPr>
+        <w:t>167 -</w:t>
+      </w:r>
+      <w:proofErr w:type="gramEnd"/>
+      <w:r>
+        <w:rPr>
+          <w:color w:val="0D0D0D" w:themeColor="text1" w:themeTint="F2"/>
+          <w:sz w:val="22"/>
+          <w:szCs w:val="22"/>
+        </w:rPr>
+        <w:t xml:space="preserve"> Two </w:t>
+      </w:r>
+      <w:proofErr w:type="spellStart"/>
+      <w:r>
+        <w:rPr>
+          <w:color w:val="0D0D0D" w:themeColor="text1" w:themeTint="F2"/>
+          <w:sz w:val="22"/>
+          <w:szCs w:val="22"/>
+        </w:rPr>
+        <w:t>Sum</w:t>
+      </w:r>
+      <w:proofErr w:type="spellEnd"/>
+      <w:r>
+        <w:rPr>
+          <w:color w:val="0D0D0D" w:themeColor="text1" w:themeTint="F2"/>
+          <w:sz w:val="22"/>
+          <w:szCs w:val="22"/>
+        </w:rPr>
+        <w:t xml:space="preserve"> </w:t>
+      </w:r>
+      <w:proofErr w:type="gramStart"/>
+      <w:r>
+        <w:rPr>
+          <w:color w:val="0D0D0D" w:themeColor="text1" w:themeTint="F2"/>
+          <w:sz w:val="22"/>
+          <w:szCs w:val="22"/>
+        </w:rPr>
+        <w:t>II -</w:t>
+      </w:r>
+      <w:proofErr w:type="gramEnd"/>
+      <w:r>
+        <w:rPr>
+          <w:color w:val="0D0D0D" w:themeColor="text1" w:themeTint="F2"/>
+          <w:sz w:val="22"/>
+          <w:szCs w:val="22"/>
+        </w:rPr>
+        <w:t xml:space="preserve"> </w:t>
+      </w:r>
+      <w:proofErr w:type="spellStart"/>
+      <w:r>
+        <w:rPr>
+          <w:color w:val="0D0D0D" w:themeColor="text1" w:themeTint="F2"/>
+          <w:sz w:val="22"/>
+          <w:szCs w:val="22"/>
+        </w:rPr>
+        <w:t>Input</w:t>
+      </w:r>
+      <w:proofErr w:type="spellEnd"/>
+      <w:r>
+        <w:rPr>
+          <w:color w:val="0D0D0D" w:themeColor="text1" w:themeTint="F2"/>
+          <w:sz w:val="22"/>
+          <w:szCs w:val="22"/>
+        </w:rPr>
+        <w:t xml:space="preserve"> </w:t>
+      </w:r>
+      <w:proofErr w:type="spellStart"/>
+      <w:r>
+        <w:rPr>
+          <w:color w:val="0D0D0D" w:themeColor="text1" w:themeTint="F2"/>
+          <w:sz w:val="22"/>
+          <w:szCs w:val="22"/>
+        </w:rPr>
+        <w:t>Array</w:t>
+      </w:r>
+      <w:proofErr w:type="spellEnd"/>
+      <w:r>
+        <w:rPr>
+          <w:color w:val="0D0D0D" w:themeColor="text1" w:themeTint="F2"/>
+          <w:sz w:val="22"/>
+          <w:szCs w:val="22"/>
+        </w:rPr>
+        <w:t xml:space="preserve"> Is </w:t>
+      </w:r>
+      <w:proofErr w:type="spellStart"/>
+      <w:r>
+        <w:rPr>
+          <w:color w:val="0D0D0D" w:themeColor="text1" w:themeTint="F2"/>
+          <w:sz w:val="22"/>
+          <w:szCs w:val="22"/>
+        </w:rPr>
+        <w:t>Sorted</w:t>
+      </w:r>
+      <w:proofErr w:type="spellEnd"/>
+      <w:r>
+        <w:rPr>
+          <w:color w:val="0D0D0D" w:themeColor="text1" w:themeTint="F2"/>
+          <w:sz w:val="22"/>
+          <w:szCs w:val="22"/>
+        </w:rPr>
+        <w:t xml:space="preserve"> (</w:t>
+      </w:r>
+      <w:proofErr w:type="spellStart"/>
+      <w:r>
+        <w:rPr>
+          <w:color w:val="0D0D0D" w:themeColor="text1" w:themeTint="F2"/>
+          <w:sz w:val="22"/>
+          <w:szCs w:val="22"/>
+        </w:rPr>
+        <w:t>Medium</w:t>
+      </w:r>
+      <w:proofErr w:type="spellEnd"/>
+      <w:r>
+        <w:rPr>
+          <w:color w:val="0D0D0D" w:themeColor="text1" w:themeTint="F2"/>
+          <w:sz w:val="22"/>
+          <w:szCs w:val="22"/>
+        </w:rPr>
+        <w:t>) problemi çözüldü.</w:t>
+      </w:r>
+    </w:p>
+    <w:p>
+      <w:pPr>
+        <w:pStyle w:val="Balk1"/>
+        <w:spacing w:before="300" w:after="150"/>
+        <w:rPr>
+          <w:color w:val="0D0D0D" w:themeColor="text1" w:themeTint="F2"/>
+          <w:sz w:val="22"/>
+          <w:szCs w:val="22"/>
+        </w:rPr>
+      </w:pPr>
+      <w:r>
+        <w:rPr>
+          <w:color w:val="0D0D0D" w:themeColor="text1" w:themeTint="F2"/>
+          <w:sz w:val="22"/>
+          <w:szCs w:val="22"/>
+        </w:rPr>
+        <w:t>Çarşamba</w:t>
+      </w:r>
+    </w:p>
+    <w:p>
+      <w:pPr>
+        <w:pStyle w:val="Balk1"/>
+        <w:spacing w:before="300" w:after="150"/>
+        <w:rPr>
+          <w:color w:val="0D0D0D" w:themeColor="text1" w:themeTint="F2"/>
+          <w:sz w:val="22"/>
+          <w:szCs w:val="22"/>
+        </w:rPr>
+      </w:pPr>
+      <w:r>
+        <w:rPr>
+          <w:color w:val="0D0D0D" w:themeColor="text1" w:themeTint="F2"/>
+          <w:sz w:val="22"/>
+          <w:szCs w:val="22"/>
+        </w:rPr>
+        <w:t xml:space="preserve">- </w:t>
+      </w:r>
+      <w:proofErr w:type="spellStart"/>
+      <w:r>
+        <w:rPr>
+          <w:color w:val="0D0D0D" w:themeColor="text1" w:themeTint="F2"/>
+          <w:sz w:val="22"/>
+          <w:szCs w:val="22"/>
+        </w:rPr>
+        <w:t>Sliding</w:t>
+      </w:r>
+      <w:proofErr w:type="spellEnd"/>
+      <w:r>
+        <w:rPr>
+          <w:color w:val="0D0D0D" w:themeColor="text1" w:themeTint="F2"/>
+          <w:sz w:val="22"/>
+          <w:szCs w:val="22"/>
+        </w:rPr>
+        <w:t xml:space="preserve"> </w:t>
+      </w:r>
+      <w:proofErr w:type="spellStart"/>
+      <w:r>
+        <w:rPr>
+          <w:color w:val="0D0D0D" w:themeColor="text1" w:themeTint="F2"/>
+          <w:sz w:val="22"/>
+          <w:szCs w:val="22"/>
+        </w:rPr>
+        <w:t>Window</w:t>
+      </w:r>
+      <w:proofErr w:type="spellEnd"/>
+      <w:r>
+        <w:rPr>
+          <w:color w:val="0D0D0D" w:themeColor="text1" w:themeTint="F2"/>
+          <w:sz w:val="22"/>
+          <w:szCs w:val="22"/>
+        </w:rPr>
+        <w:t xml:space="preserve"> tekniği öğrenildi: sabit boyutlu bir pencerenin dizi üzerinde kaydırılması, pencereden çıkan ve pencereye giren elemanların takip edilmesi mantığı kavrandı.</w:t>
+      </w:r>
+    </w:p>
+    <w:p>
+      <w:pPr>
+        <w:pStyle w:val="Balk1"/>
+        <w:spacing w:before="300" w:after="150"/>
+        <w:rPr>
+          <w:color w:val="0D0D0D" w:themeColor="text1" w:themeTint="F2"/>
+          <w:sz w:val="22"/>
+          <w:szCs w:val="22"/>
+        </w:rPr>
+      </w:pPr>
+      <w:r>
+        <w:rPr>
+          <w:color w:val="0D0D0D" w:themeColor="text1" w:themeTint="F2"/>
+          <w:sz w:val="22"/>
+          <w:szCs w:val="22"/>
+        </w:rPr>
+        <w:t xml:space="preserve">- </w:t>
+      </w:r>
+      <w:proofErr w:type="spellStart"/>
+      <w:r>
+        <w:rPr>
+          <w:color w:val="0D0D0D" w:themeColor="text1" w:themeTint="F2"/>
+          <w:sz w:val="22"/>
+          <w:szCs w:val="22"/>
+        </w:rPr>
+        <w:t>LeetCode</w:t>
+      </w:r>
+      <w:proofErr w:type="spellEnd"/>
+      <w:r>
+        <w:rPr>
+          <w:color w:val="0D0D0D" w:themeColor="text1" w:themeTint="F2"/>
+          <w:sz w:val="22"/>
+          <w:szCs w:val="22"/>
+        </w:rPr>
+        <w:t xml:space="preserve">: </w:t>
+      </w:r>
+      <w:proofErr w:type="gramStart"/>
+      <w:r>
+        <w:rPr>
+          <w:color w:val="0D0D0D" w:themeColor="text1" w:themeTint="F2"/>
+          <w:sz w:val="22"/>
+          <w:szCs w:val="22"/>
+        </w:rPr>
+        <w:t>1456 -</w:t>
+      </w:r>
+      <w:proofErr w:type="gramEnd"/>
+      <w:r>
+        <w:rPr>
+          <w:color w:val="0D0D0D" w:themeColor="text1" w:themeTint="F2"/>
+          <w:sz w:val="22"/>
+          <w:szCs w:val="22"/>
+        </w:rPr>
+        <w:t xml:space="preserve"> Maximum </w:t>
+      </w:r>
+      <w:proofErr w:type="spellStart"/>
+      <w:r>
+        <w:rPr>
+          <w:color w:val="0D0D0D" w:themeColor="text1" w:themeTint="F2"/>
+          <w:sz w:val="22"/>
+          <w:szCs w:val="22"/>
+        </w:rPr>
+        <w:t>Number</w:t>
+      </w:r>
+      <w:proofErr w:type="spellEnd"/>
+      <w:r>
+        <w:rPr>
+          <w:color w:val="0D0D0D" w:themeColor="text1" w:themeTint="F2"/>
+          <w:sz w:val="22"/>
+          <w:szCs w:val="22"/>
+        </w:rPr>
+        <w:t xml:space="preserve"> of </w:t>
+      </w:r>
+      <w:proofErr w:type="spellStart"/>
+      <w:r>
+        <w:rPr>
+          <w:color w:val="0D0D0D" w:themeColor="text1" w:themeTint="F2"/>
+          <w:sz w:val="22"/>
+          <w:szCs w:val="22"/>
+        </w:rPr>
+        <w:t>Vowels</w:t>
+      </w:r>
+      <w:proofErr w:type="spellEnd"/>
+      <w:r>
+        <w:rPr>
+          <w:color w:val="0D0D0D" w:themeColor="text1" w:themeTint="F2"/>
+          <w:sz w:val="22"/>
+          <w:szCs w:val="22"/>
+        </w:rPr>
+        <w:t xml:space="preserve"> in a </w:t>
+      </w:r>
+      <w:proofErr w:type="spellStart"/>
+      <w:r>
+        <w:rPr>
+          <w:color w:val="0D0D0D" w:themeColor="text1" w:themeTint="F2"/>
+          <w:sz w:val="22"/>
+          <w:szCs w:val="22"/>
+        </w:rPr>
+        <w:t>Substring</w:t>
+      </w:r>
+      <w:proofErr w:type="spellEnd"/>
+      <w:r>
+        <w:rPr>
+          <w:color w:val="0D0D0D" w:themeColor="text1" w:themeTint="F2"/>
+          <w:sz w:val="22"/>
+          <w:szCs w:val="22"/>
+        </w:rPr>
+        <w:t xml:space="preserve"> of </w:t>
+      </w:r>
+      <w:proofErr w:type="spellStart"/>
+      <w:r>
+        <w:rPr>
+          <w:color w:val="0D0D0D" w:themeColor="text1" w:themeTint="F2"/>
+          <w:sz w:val="22"/>
+          <w:szCs w:val="22"/>
+        </w:rPr>
+        <w:t>Given</w:t>
+      </w:r>
+      <w:proofErr w:type="spellEnd"/>
+      <w:r>
+        <w:rPr>
+          <w:color w:val="0D0D0D" w:themeColor="text1" w:themeTint="F2"/>
+          <w:sz w:val="22"/>
+          <w:szCs w:val="22"/>
+        </w:rPr>
+        <w:t xml:space="preserve"> </w:t>
+      </w:r>
+      <w:proofErr w:type="spellStart"/>
+      <w:r>
+        <w:rPr>
+          <w:color w:val="0D0D0D" w:themeColor="text1" w:themeTint="F2"/>
+          <w:sz w:val="22"/>
+          <w:szCs w:val="22"/>
+        </w:rPr>
+        <w:t>Length</w:t>
+      </w:r>
+      <w:proofErr w:type="spellEnd"/>
+      <w:r>
+        <w:rPr>
+          <w:color w:val="0D0D0D" w:themeColor="text1" w:themeTint="F2"/>
+          <w:sz w:val="22"/>
+          <w:szCs w:val="22"/>
+        </w:rPr>
+        <w:t xml:space="preserve"> (</w:t>
+      </w:r>
+      <w:proofErr w:type="spellStart"/>
+      <w:r>
+        <w:rPr>
+          <w:color w:val="0D0D0D" w:themeColor="text1" w:themeTint="F2"/>
+          <w:sz w:val="22"/>
+          <w:szCs w:val="22"/>
+        </w:rPr>
+        <w:t>Medium</w:t>
+      </w:r>
+      <w:proofErr w:type="spellEnd"/>
+      <w:r>
+        <w:rPr>
+          <w:color w:val="0D0D0D" w:themeColor="text1" w:themeTint="F2"/>
+          <w:sz w:val="22"/>
+          <w:szCs w:val="22"/>
+        </w:rPr>
+        <w:t xml:space="preserve">) problemi çözüldü, </w:t>
+      </w:r>
+      <w:proofErr w:type="spellStart"/>
+      <w:r>
+        <w:rPr>
+          <w:color w:val="0D0D0D" w:themeColor="text1" w:themeTint="F2"/>
+          <w:sz w:val="22"/>
+          <w:szCs w:val="22"/>
+        </w:rPr>
+        <w:t>Sliding</w:t>
+      </w:r>
+      <w:proofErr w:type="spellEnd"/>
+      <w:r>
+        <w:rPr>
+          <w:color w:val="0D0D0D" w:themeColor="text1" w:themeTint="F2"/>
+          <w:sz w:val="22"/>
+          <w:szCs w:val="22"/>
+        </w:rPr>
+        <w:t xml:space="preserve"> </w:t>
+      </w:r>
+      <w:proofErr w:type="spellStart"/>
+      <w:r>
+        <w:rPr>
+          <w:color w:val="0D0D0D" w:themeColor="text1" w:themeTint="F2"/>
+          <w:sz w:val="22"/>
+          <w:szCs w:val="22"/>
+        </w:rPr>
+        <w:t>Window</w:t>
+      </w:r>
+      <w:proofErr w:type="spellEnd"/>
+      <w:r>
+        <w:rPr>
+          <w:color w:val="0D0D0D" w:themeColor="text1" w:themeTint="F2"/>
+          <w:sz w:val="22"/>
+          <w:szCs w:val="22"/>
+        </w:rPr>
+        <w:t xml:space="preserve"> tekniği pratik edildi.</w:t>
+      </w:r>
+    </w:p>
+    <w:p>
+      <w:pPr>
+        <w:pStyle w:val="Balk1"/>
+        <w:spacing w:before="300" w:after="150"/>
+        <w:rPr>
+          <w:color w:val="0D0D0D" w:themeColor="text1" w:themeTint="F2"/>
+          <w:sz w:val="22"/>
+          <w:szCs w:val="22"/>
+        </w:rPr>
+      </w:pPr>
+      <w:r>
+        <w:rPr>
+          <w:color w:val="0D0D0D" w:themeColor="text1" w:themeTint="F2"/>
+          <w:sz w:val="22"/>
+          <w:szCs w:val="22"/>
+        </w:rPr>
+        <w:t>Perşembe</w:t>
+      </w:r>
+    </w:p>
+    <w:p>
+      <w:pPr>
+        <w:pStyle w:val="Balk1"/>
+        <w:spacing w:before="300" w:after="150"/>
+        <w:rPr>
+          <w:color w:val="0D0D0D" w:themeColor="text1" w:themeTint="F2"/>
+          <w:sz w:val="22"/>
+          <w:szCs w:val="22"/>
+        </w:rPr>
+      </w:pPr>
+      <w:r>
+        <w:rPr>
+          <w:color w:val="0D0D0D" w:themeColor="text1" w:themeTint="F2"/>
+          <w:sz w:val="22"/>
+          <w:szCs w:val="22"/>
+        </w:rPr>
+        <w:t xml:space="preserve">- </w:t>
+      </w:r>
+      <w:proofErr w:type="spellStart"/>
+      <w:r>
+        <w:rPr>
+          <w:color w:val="0D0D0D" w:themeColor="text1" w:themeTint="F2"/>
+          <w:sz w:val="22"/>
+          <w:szCs w:val="22"/>
+        </w:rPr>
+        <w:t>Recursion</w:t>
+      </w:r>
+      <w:proofErr w:type="spellEnd"/>
+      <w:r>
+        <w:rPr>
+          <w:color w:val="0D0D0D" w:themeColor="text1" w:themeTint="F2"/>
+          <w:sz w:val="22"/>
+          <w:szCs w:val="22"/>
+        </w:rPr>
+        <w:t xml:space="preserve"> tekrarı yapıldı: </w:t>
+      </w:r>
+      <w:proofErr w:type="spellStart"/>
+      <w:r>
+        <w:rPr>
+          <w:color w:val="0D0D0D" w:themeColor="text1" w:themeTint="F2"/>
+          <w:sz w:val="22"/>
+          <w:szCs w:val="22"/>
+        </w:rPr>
+        <w:t>factorial</w:t>
+      </w:r>
+      <w:proofErr w:type="spellEnd"/>
+      <w:r>
+        <w:rPr>
+          <w:color w:val="0D0D0D" w:themeColor="text1" w:themeTint="F2"/>
+          <w:sz w:val="22"/>
+          <w:szCs w:val="22"/>
+        </w:rPr>
+        <w:t xml:space="preserve"> ve </w:t>
+      </w:r>
+      <w:proofErr w:type="spellStart"/>
+      <w:r>
+        <w:rPr>
+          <w:color w:val="0D0D0D" w:themeColor="text1" w:themeTint="F2"/>
+          <w:sz w:val="22"/>
+          <w:szCs w:val="22"/>
+        </w:rPr>
+        <w:t>fibonacci</w:t>
+      </w:r>
+      <w:proofErr w:type="spellEnd"/>
+      <w:r>
+        <w:rPr>
+          <w:color w:val="0D0D0D" w:themeColor="text1" w:themeTint="F2"/>
+          <w:sz w:val="22"/>
+          <w:szCs w:val="22"/>
+        </w:rPr>
+        <w:t xml:space="preserve"> fonksiyonları hem iteratif hem </w:t>
+      </w:r>
+      <w:proofErr w:type="spellStart"/>
+      <w:r>
+        <w:rPr>
+          <w:color w:val="0D0D0D" w:themeColor="text1" w:themeTint="F2"/>
+          <w:sz w:val="22"/>
+          <w:szCs w:val="22"/>
+        </w:rPr>
+        <w:t>recursive</w:t>
+      </w:r>
+      <w:proofErr w:type="spellEnd"/>
+      <w:r>
+        <w:rPr>
+          <w:color w:val="0D0D0D" w:themeColor="text1" w:themeTint="F2"/>
+          <w:sz w:val="22"/>
+          <w:szCs w:val="22"/>
+        </w:rPr>
+        <w:t xml:space="preserve"> olarak yazıldı, </w:t>
+      </w:r>
+      <w:proofErr w:type="spellStart"/>
+      <w:r>
+        <w:rPr>
+          <w:color w:val="0D0D0D" w:themeColor="text1" w:themeTint="F2"/>
+          <w:sz w:val="22"/>
+          <w:szCs w:val="22"/>
+        </w:rPr>
+        <w:t>base</w:t>
+      </w:r>
+      <w:proofErr w:type="spellEnd"/>
+      <w:r>
+        <w:rPr>
+          <w:color w:val="0D0D0D" w:themeColor="text1" w:themeTint="F2"/>
+          <w:sz w:val="22"/>
+          <w:szCs w:val="22"/>
+        </w:rPr>
+        <w:t xml:space="preserve"> </w:t>
+      </w:r>
+      <w:proofErr w:type="spellStart"/>
+      <w:r>
+        <w:rPr>
+          <w:color w:val="0D0D0D" w:themeColor="text1" w:themeTint="F2"/>
+          <w:sz w:val="22"/>
+          <w:szCs w:val="22"/>
+        </w:rPr>
+        <w:t>case</w:t>
+      </w:r>
+      <w:proofErr w:type="spellEnd"/>
+      <w:r>
+        <w:rPr>
+          <w:color w:val="0D0D0D" w:themeColor="text1" w:themeTint="F2"/>
+          <w:sz w:val="22"/>
+          <w:szCs w:val="22"/>
+        </w:rPr>
+        <w:t xml:space="preserve"> ve </w:t>
+      </w:r>
+      <w:proofErr w:type="spellStart"/>
+      <w:r>
+        <w:rPr>
+          <w:color w:val="0D0D0D" w:themeColor="text1" w:themeTint="F2"/>
+          <w:sz w:val="22"/>
+          <w:szCs w:val="22"/>
+        </w:rPr>
+        <w:t>recursive</w:t>
+      </w:r>
+      <w:proofErr w:type="spellEnd"/>
+      <w:r>
+        <w:rPr>
+          <w:color w:val="0D0D0D" w:themeColor="text1" w:themeTint="F2"/>
+          <w:sz w:val="22"/>
+          <w:szCs w:val="22"/>
+        </w:rPr>
+        <w:t xml:space="preserve"> </w:t>
+      </w:r>
+      <w:proofErr w:type="spellStart"/>
+      <w:r>
+        <w:rPr>
+          <w:color w:val="0D0D0D" w:themeColor="text1" w:themeTint="F2"/>
+          <w:sz w:val="22"/>
+          <w:szCs w:val="22"/>
+        </w:rPr>
+        <w:t>case</w:t>
+      </w:r>
+      <w:proofErr w:type="spellEnd"/>
+      <w:r>
+        <w:rPr>
+          <w:color w:val="0D0D0D" w:themeColor="text1" w:themeTint="F2"/>
+          <w:sz w:val="22"/>
+          <w:szCs w:val="22"/>
+        </w:rPr>
+        <w:t xml:space="preserve"> mantığı pekiştirildi.</w:t>
+      </w:r>
+    </w:p>
+    <w:p>
+      <w:pPr>
+        <w:pStyle w:val="Balk1"/>
+        <w:spacing w:before="300" w:after="150"/>
+        <w:rPr>
+          <w:color w:val="0D0D0D" w:themeColor="text1" w:themeTint="F2"/>
+          <w:sz w:val="22"/>
+          <w:szCs w:val="22"/>
+        </w:rPr>
+      </w:pPr>
+      <w:r>
+        <w:rPr>
+          <w:color w:val="0D0D0D" w:themeColor="text1" w:themeTint="F2"/>
+          <w:sz w:val="22"/>
+          <w:szCs w:val="22"/>
+        </w:rPr>
+        <w:t>Cuma</w:t>
+      </w:r>
+    </w:p>
+    <w:p>
+      <w:pPr>
+        <w:pStyle w:val="Balk1"/>
+        <w:spacing w:before="300" w:after="150"/>
+        <w:rPr>
+          <w:color w:val="0D0D0D" w:themeColor="text1" w:themeTint="F2"/>
+          <w:sz w:val="22"/>
+          <w:szCs w:val="22"/>
+        </w:rPr>
+      </w:pPr>
+      <w:r>
+        <w:rPr>
+          <w:color w:val="0D0D0D" w:themeColor="text1" w:themeTint="F2"/>
+          <w:sz w:val="22"/>
+          <w:szCs w:val="22"/>
+        </w:rPr>
+        <w:t xml:space="preserve">- </w:t>
+      </w:r>
+      <w:proofErr w:type="spellStart"/>
+      <w:r>
+        <w:rPr>
+          <w:color w:val="0D0D0D" w:themeColor="text1" w:themeTint="F2"/>
+          <w:sz w:val="22"/>
+          <w:szCs w:val="22"/>
+        </w:rPr>
+        <w:t>LeetCode</w:t>
+      </w:r>
+      <w:proofErr w:type="spellEnd"/>
+      <w:r>
+        <w:rPr>
+          <w:color w:val="0D0D0D" w:themeColor="text1" w:themeTint="F2"/>
+          <w:sz w:val="22"/>
+          <w:szCs w:val="22"/>
+        </w:rPr>
+        <w:t xml:space="preserve">: </w:t>
+      </w:r>
+      <w:proofErr w:type="gramStart"/>
+      <w:r>
+        <w:rPr>
+          <w:color w:val="0D0D0D" w:themeColor="text1" w:themeTint="F2"/>
+          <w:sz w:val="22"/>
+          <w:szCs w:val="22"/>
+        </w:rPr>
+        <w:t>342 -</w:t>
+      </w:r>
+      <w:proofErr w:type="gramEnd"/>
+      <w:r>
+        <w:rPr>
+          <w:color w:val="0D0D0D" w:themeColor="text1" w:themeTint="F2"/>
+          <w:sz w:val="22"/>
+          <w:szCs w:val="22"/>
+        </w:rPr>
+        <w:t xml:space="preserve"> </w:t>
+      </w:r>
+      <w:proofErr w:type="spellStart"/>
+      <w:r>
+        <w:rPr>
+          <w:color w:val="0D0D0D" w:themeColor="text1" w:themeTint="F2"/>
+          <w:sz w:val="22"/>
+          <w:szCs w:val="22"/>
+        </w:rPr>
+        <w:t>Power</w:t>
+      </w:r>
+      <w:proofErr w:type="spellEnd"/>
+      <w:r>
+        <w:rPr>
+          <w:color w:val="0D0D0D" w:themeColor="text1" w:themeTint="F2"/>
+          <w:sz w:val="22"/>
+          <w:szCs w:val="22"/>
+        </w:rPr>
+        <w:t xml:space="preserve"> of </w:t>
+      </w:r>
+      <w:proofErr w:type="spellStart"/>
+      <w:r>
+        <w:rPr>
+          <w:color w:val="0D0D0D" w:themeColor="text1" w:themeTint="F2"/>
+          <w:sz w:val="22"/>
+          <w:szCs w:val="22"/>
+        </w:rPr>
+        <w:t>Four</w:t>
+      </w:r>
+      <w:proofErr w:type="spellEnd"/>
+      <w:r>
+        <w:rPr>
+          <w:color w:val="0D0D0D" w:themeColor="text1" w:themeTint="F2"/>
+          <w:sz w:val="22"/>
+          <w:szCs w:val="22"/>
+        </w:rPr>
+        <w:t xml:space="preserve"> (</w:t>
+      </w:r>
+      <w:proofErr w:type="spellStart"/>
+      <w:r>
+        <w:rPr>
+          <w:color w:val="0D0D0D" w:themeColor="text1" w:themeTint="F2"/>
+          <w:sz w:val="22"/>
+          <w:szCs w:val="22"/>
+        </w:rPr>
+        <w:t>Easy</w:t>
+      </w:r>
+      <w:proofErr w:type="spellEnd"/>
+      <w:r>
+        <w:rPr>
+          <w:color w:val="0D0D0D" w:themeColor="text1" w:themeTint="F2"/>
+          <w:sz w:val="22"/>
+          <w:szCs w:val="22"/>
+        </w:rPr>
+        <w:t xml:space="preserve">) problemi </w:t>
+      </w:r>
+      <w:proofErr w:type="spellStart"/>
+      <w:r>
+        <w:rPr>
+          <w:color w:val="0D0D0D" w:themeColor="text1" w:themeTint="F2"/>
+          <w:sz w:val="22"/>
+          <w:szCs w:val="22"/>
+        </w:rPr>
+        <w:t>recursion</w:t>
+      </w:r>
+      <w:proofErr w:type="spellEnd"/>
+      <w:r>
+        <w:rPr>
+          <w:color w:val="0D0D0D" w:themeColor="text1" w:themeTint="F2"/>
+          <w:sz w:val="22"/>
+          <w:szCs w:val="22"/>
+        </w:rPr>
+        <w:t xml:space="preserve"> kullanılarak çözüldü</w:t>
+      </w:r>
+    </w:p>
+    <w:p>
+      <w:pPr>
+        <w:pStyle w:val="Balk1"/>
+        <w:spacing w:before="300" w:after="150"/>
+        <w:rPr>
+          <w:color w:val="0D0D0D" w:themeColor="text1" w:themeTint="F2"/>
+        </w:rPr>
+      </w:pPr>
+      <w:r>
+        <w:rPr>
+          <w:color w:val="0D0D0D" w:themeColor="text1" w:themeTint="F2"/>
+        </w:rPr>
+        <w:t>2.Kullanılan Teknikler</w:t>
+      </w:r>
+    </w:p>
+    <w:p>
+      <w:pPr>
+        <w:pStyle w:val="Balk1"/>
+        <w:spacing w:before="300" w:after="150"/>
+        <w:rPr>
+          <w:color w:val="0D0D0D" w:themeColor="text1" w:themeTint="F2"/>
+          <w:sz w:val="22"/>
+          <w:szCs w:val="22"/>
+        </w:rPr>
+      </w:pPr>
+      <w:proofErr w:type="gramStart"/>
+      <w:r>
+        <w:rPr>
+          <w:color w:val="0D0D0D" w:themeColor="text1" w:themeTint="F2"/>
+          <w:sz w:val="22"/>
+          <w:szCs w:val="22"/>
+        </w:rPr>
+        <w:t>A)</w:t>
+      </w:r>
+      <w:proofErr w:type="spellStart"/>
+      <w:r>
+        <w:rPr>
+          <w:color w:val="0D0D0D" w:themeColor="text1" w:themeTint="F2"/>
+          <w:sz w:val="22"/>
+          <w:szCs w:val="22"/>
+        </w:rPr>
+        <w:t>Sliding</w:t>
+      </w:r>
+      <w:proofErr w:type="spellEnd"/>
+      <w:proofErr w:type="gramEnd"/>
+      <w:r>
+        <w:rPr>
+          <w:color w:val="0D0D0D" w:themeColor="text1" w:themeTint="F2"/>
+          <w:sz w:val="22"/>
+          <w:szCs w:val="22"/>
+        </w:rPr>
+        <w:t xml:space="preserve"> </w:t>
+      </w:r>
+      <w:proofErr w:type="spellStart"/>
+      <w:r>
+        <w:rPr>
+          <w:color w:val="0D0D0D" w:themeColor="text1" w:themeTint="F2"/>
+          <w:sz w:val="22"/>
+          <w:szCs w:val="22"/>
+        </w:rPr>
+        <w:t>Window</w:t>
+      </w:r>
+      <w:proofErr w:type="spellEnd"/>
+      <w:r>
+        <w:rPr>
+          <w:color w:val="0D0D0D" w:themeColor="text1" w:themeTint="F2"/>
+          <w:sz w:val="22"/>
+          <w:szCs w:val="22"/>
+        </w:rPr>
+        <w:t xml:space="preserve"> Tekniğinin Adım Adım Uygulanması</w:t>
+      </w:r>
+    </w:p>
+    <w:p>
+      <w:pPr>
+        <w:pStyle w:val="Balk1"/>
+        <w:spacing w:before="300" w:after="150"/>
+        <w:rPr>
+          <w:color w:val="0D0D0D" w:themeColor="text1" w:themeTint="F2"/>
+          <w:sz w:val="22"/>
+          <w:szCs w:val="22"/>
+        </w:rPr>
+      </w:pPr>
+      <w:r>
+        <w:rPr>
+          <w:color w:val="0D0D0D" w:themeColor="text1" w:themeTint="F2"/>
+          <w:sz w:val="22"/>
+          <w:szCs w:val="22"/>
+        </w:rPr>
+        <w:t>Örnek olarak s = "</w:t>
+      </w:r>
+      <w:proofErr w:type="spellStart"/>
+      <w:r>
+        <w:rPr>
+          <w:color w:val="0D0D0D" w:themeColor="text1" w:themeTint="F2"/>
+          <w:sz w:val="22"/>
+          <w:szCs w:val="22"/>
+        </w:rPr>
+        <w:t>abciiidef</w:t>
+      </w:r>
+      <w:proofErr w:type="spellEnd"/>
+      <w:r>
+        <w:rPr>
+          <w:color w:val="0D0D0D" w:themeColor="text1" w:themeTint="F2"/>
+          <w:sz w:val="22"/>
+          <w:szCs w:val="22"/>
+        </w:rPr>
+        <w:t xml:space="preserve">" ve k = 3 değerleri kullanılmıştır. Amaç, uzunluğu 3 olan </w:t>
+      </w:r>
+      <w:proofErr w:type="spellStart"/>
+      <w:r>
+        <w:rPr>
+          <w:color w:val="0D0D0D" w:themeColor="text1" w:themeTint="F2"/>
+          <w:sz w:val="22"/>
+          <w:szCs w:val="22"/>
+        </w:rPr>
+        <w:t>substringler</w:t>
+      </w:r>
+      <w:proofErr w:type="spellEnd"/>
+      <w:r>
+        <w:rPr>
+          <w:color w:val="0D0D0D" w:themeColor="text1" w:themeTint="F2"/>
+          <w:sz w:val="22"/>
+          <w:szCs w:val="22"/>
+        </w:rPr>
+        <w:t xml:space="preserve"> içerisindeki en fazla sesli harf sayısını bulmaktır.</w:t>
+      </w:r>
+    </w:p>
+    <w:p>
+      <w:pPr>
+        <w:pStyle w:val="Balk1"/>
+        <w:spacing w:before="300" w:after="150"/>
+        <w:rPr>
+          <w:color w:val="0D0D0D" w:themeColor="text1" w:themeTint="F2"/>
+          <w:sz w:val="22"/>
+          <w:szCs w:val="22"/>
+        </w:rPr>
+      </w:pPr>
+      <w:r>
+        <w:rPr>
+          <w:color w:val="0D0D0D" w:themeColor="text1" w:themeTint="F2"/>
+          <w:sz w:val="22"/>
+          <w:szCs w:val="22"/>
+        </w:rPr>
+        <w:t>İlk olarak ilk 3 karakterden oluşan pencere oluşturulur:</w:t>
+      </w:r>
+    </w:p>
+    <w:p>
+      <w:pPr>
+        <w:pStyle w:val="Balk1"/>
+        <w:spacing w:before="300" w:after="150"/>
+        <w:rPr>
+          <w:color w:val="0D0D0D" w:themeColor="text1" w:themeTint="F2"/>
+          <w:sz w:val="22"/>
+          <w:szCs w:val="22"/>
+        </w:rPr>
+      </w:pPr>
+      <w:r>
+        <w:rPr>
+          <w:color w:val="0D0D0D" w:themeColor="text1" w:themeTint="F2"/>
+          <w:sz w:val="22"/>
+          <w:szCs w:val="22"/>
+        </w:rPr>
+        <w:t>[</w:t>
+      </w:r>
+      <w:proofErr w:type="gramStart"/>
+      <w:r>
+        <w:rPr>
+          <w:color w:val="0D0D0D" w:themeColor="text1" w:themeTint="F2"/>
+          <w:sz w:val="22"/>
+          <w:szCs w:val="22"/>
+        </w:rPr>
+        <w:t>a</w:t>
+      </w:r>
+      <w:proofErr w:type="gramEnd"/>
+      <w:r>
+        <w:rPr>
+          <w:color w:val="0D0D0D" w:themeColor="text1" w:themeTint="F2"/>
+          <w:sz w:val="22"/>
+          <w:szCs w:val="22"/>
+        </w:rPr>
+        <w:t xml:space="preserve"> b c] i </w:t>
+      </w:r>
+      <w:proofErr w:type="spellStart"/>
+      <w:r>
+        <w:rPr>
+          <w:color w:val="0D0D0D" w:themeColor="text1" w:themeTint="F2"/>
+          <w:sz w:val="22"/>
+          <w:szCs w:val="22"/>
+        </w:rPr>
+        <w:t>i</w:t>
+      </w:r>
+      <w:proofErr w:type="spellEnd"/>
+      <w:r>
+        <w:rPr>
+          <w:color w:val="0D0D0D" w:themeColor="text1" w:themeTint="F2"/>
+          <w:sz w:val="22"/>
+          <w:szCs w:val="22"/>
+        </w:rPr>
+        <w:t xml:space="preserve"> </w:t>
+      </w:r>
+      <w:proofErr w:type="spellStart"/>
+      <w:r>
+        <w:rPr>
+          <w:color w:val="0D0D0D" w:themeColor="text1" w:themeTint="F2"/>
+          <w:sz w:val="22"/>
+          <w:szCs w:val="22"/>
+        </w:rPr>
+        <w:t>i</w:t>
+      </w:r>
+      <w:proofErr w:type="spellEnd"/>
+      <w:r>
+        <w:rPr>
+          <w:color w:val="0D0D0D" w:themeColor="text1" w:themeTint="F2"/>
+          <w:sz w:val="22"/>
+          <w:szCs w:val="22"/>
+        </w:rPr>
+        <w:t xml:space="preserve"> d e f</w:t>
+      </w:r>
+    </w:p>
+    <w:p>
+      <w:pPr>
+        <w:pStyle w:val="Balk1"/>
+        <w:spacing w:before="300" w:after="150"/>
+        <w:rPr>
+          <w:color w:val="0D0D0D" w:themeColor="text1" w:themeTint="F2"/>
+          <w:sz w:val="22"/>
+          <w:szCs w:val="22"/>
+        </w:rPr>
+      </w:pPr>
+      <w:r>
+        <w:rPr>
+          <w:color w:val="0D0D0D" w:themeColor="text1" w:themeTint="F2"/>
+          <w:sz w:val="22"/>
+          <w:szCs w:val="22"/>
+        </w:rPr>
+        <w:lastRenderedPageBreak/>
+        <w:t>Bu pencerede yalnızca a sesli olduğu için sesli harf sayısı 1 olur.</w:t>
+      </w:r>
+    </w:p>
+    <w:p>
+      <w:pPr>
+        <w:pStyle w:val="Balk1"/>
+        <w:spacing w:before="300" w:after="150"/>
+        <w:rPr>
+          <w:color w:val="0D0D0D" w:themeColor="text1" w:themeTint="F2"/>
+          <w:sz w:val="22"/>
+          <w:szCs w:val="22"/>
+        </w:rPr>
+      </w:pPr>
+      <w:r>
+        <w:rPr>
+          <w:color w:val="0D0D0D" w:themeColor="text1" w:themeTint="F2"/>
+          <w:sz w:val="22"/>
+          <w:szCs w:val="22"/>
+        </w:rPr>
+        <w:t>Pencere bir karakter sağa kaydırılır:</w:t>
+      </w:r>
+    </w:p>
+    <w:p>
+      <w:pPr>
+        <w:pStyle w:val="Balk1"/>
+        <w:spacing w:before="300" w:after="150"/>
+        <w:rPr>
+          <w:color w:val="0D0D0D" w:themeColor="text1" w:themeTint="F2"/>
+          <w:sz w:val="22"/>
+          <w:szCs w:val="22"/>
+        </w:rPr>
+      </w:pPr>
+      <w:proofErr w:type="gramStart"/>
+      <w:r>
+        <w:rPr>
+          <w:color w:val="0D0D0D" w:themeColor="text1" w:themeTint="F2"/>
+          <w:sz w:val="22"/>
+          <w:szCs w:val="22"/>
+        </w:rPr>
+        <w:t>a</w:t>
+      </w:r>
+      <w:proofErr w:type="gramEnd"/>
+      <w:r>
+        <w:rPr>
+          <w:color w:val="0D0D0D" w:themeColor="text1" w:themeTint="F2"/>
+          <w:sz w:val="22"/>
+          <w:szCs w:val="22"/>
+        </w:rPr>
+        <w:t xml:space="preserve"> </w:t>
+      </w:r>
+      <w:proofErr w:type="gramStart"/>
+      <w:r>
+        <w:rPr>
+          <w:color w:val="0D0D0D" w:themeColor="text1" w:themeTint="F2"/>
+          <w:sz w:val="22"/>
+          <w:szCs w:val="22"/>
+        </w:rPr>
+        <w:t>[ b</w:t>
+      </w:r>
+      <w:proofErr w:type="gramEnd"/>
+      <w:r>
+        <w:rPr>
+          <w:color w:val="0D0D0D" w:themeColor="text1" w:themeTint="F2"/>
+          <w:sz w:val="22"/>
+          <w:szCs w:val="22"/>
+        </w:rPr>
+        <w:t xml:space="preserve"> c </w:t>
+      </w:r>
+      <w:proofErr w:type="gramStart"/>
+      <w:r>
+        <w:rPr>
+          <w:color w:val="0D0D0D" w:themeColor="text1" w:themeTint="F2"/>
+          <w:sz w:val="22"/>
+          <w:szCs w:val="22"/>
+        </w:rPr>
+        <w:t>i ]</w:t>
+      </w:r>
+      <w:proofErr w:type="gramEnd"/>
+      <w:r>
+        <w:rPr>
+          <w:color w:val="0D0D0D" w:themeColor="text1" w:themeTint="F2"/>
+          <w:sz w:val="22"/>
+          <w:szCs w:val="22"/>
+        </w:rPr>
+        <w:t xml:space="preserve"> i </w:t>
+      </w:r>
+      <w:proofErr w:type="spellStart"/>
+      <w:r>
+        <w:rPr>
+          <w:color w:val="0D0D0D" w:themeColor="text1" w:themeTint="F2"/>
+          <w:sz w:val="22"/>
+          <w:szCs w:val="22"/>
+        </w:rPr>
+        <w:t>i</w:t>
+      </w:r>
+      <w:proofErr w:type="spellEnd"/>
+      <w:r>
+        <w:rPr>
+          <w:color w:val="0D0D0D" w:themeColor="text1" w:themeTint="F2"/>
+          <w:sz w:val="22"/>
+          <w:szCs w:val="22"/>
+        </w:rPr>
+        <w:t xml:space="preserve"> d e f</w:t>
+      </w:r>
+    </w:p>
+    <w:p>
+      <w:pPr>
+        <w:pStyle w:val="Balk1"/>
+        <w:spacing w:before="300" w:after="150"/>
+        <w:rPr>
+          <w:color w:val="0D0D0D" w:themeColor="text1" w:themeTint="F2"/>
+          <w:sz w:val="22"/>
+          <w:szCs w:val="22"/>
+        </w:rPr>
+      </w:pPr>
+      <w:r>
+        <w:rPr>
+          <w:color w:val="0D0D0D" w:themeColor="text1" w:themeTint="F2"/>
+          <w:sz w:val="22"/>
+          <w:szCs w:val="22"/>
+        </w:rPr>
+        <w:t xml:space="preserve">Bu işlem sırasında a pencereden çıkar ve i pencereye girer. </w:t>
+      </w:r>
+      <w:proofErr w:type="gramStart"/>
+      <w:r>
+        <w:rPr>
+          <w:color w:val="0D0D0D" w:themeColor="text1" w:themeTint="F2"/>
+          <w:sz w:val="22"/>
+          <w:szCs w:val="22"/>
+        </w:rPr>
+        <w:t>a</w:t>
+      </w:r>
+      <w:proofErr w:type="gramEnd"/>
+      <w:r>
+        <w:rPr>
+          <w:color w:val="0D0D0D" w:themeColor="text1" w:themeTint="F2"/>
+          <w:sz w:val="22"/>
+          <w:szCs w:val="22"/>
+        </w:rPr>
+        <w:t xml:space="preserve"> sesli olduğu için sayı 1 azalır, i sesli olduğu için 1 artar. Sonuç tekrar 1 olur.</w:t>
+      </w:r>
+    </w:p>
+    <w:p>
+      <w:pPr>
+        <w:pStyle w:val="Balk1"/>
+        <w:spacing w:before="300" w:after="150"/>
+        <w:rPr>
+          <w:color w:val="0D0D0D" w:themeColor="text1" w:themeTint="F2"/>
+          <w:sz w:val="22"/>
+          <w:szCs w:val="22"/>
+        </w:rPr>
+      </w:pPr>
+      <w:r>
+        <w:rPr>
+          <w:color w:val="0D0D0D" w:themeColor="text1" w:themeTint="F2"/>
+          <w:sz w:val="22"/>
+          <w:szCs w:val="22"/>
+        </w:rPr>
+        <w:t>Pencere tekrar kaydırılır:</w:t>
+      </w:r>
+    </w:p>
+    <w:p>
+      <w:pPr>
+        <w:pStyle w:val="Balk1"/>
+        <w:spacing w:before="300" w:after="150"/>
+        <w:rPr>
+          <w:color w:val="0D0D0D" w:themeColor="text1" w:themeTint="F2"/>
+          <w:sz w:val="22"/>
+          <w:szCs w:val="22"/>
+        </w:rPr>
+      </w:pPr>
+      <w:proofErr w:type="gramStart"/>
+      <w:r>
+        <w:rPr>
+          <w:color w:val="0D0D0D" w:themeColor="text1" w:themeTint="F2"/>
+          <w:sz w:val="22"/>
+          <w:szCs w:val="22"/>
+        </w:rPr>
+        <w:t>a</w:t>
+      </w:r>
+      <w:proofErr w:type="gramEnd"/>
+      <w:r>
+        <w:rPr>
+          <w:color w:val="0D0D0D" w:themeColor="text1" w:themeTint="F2"/>
+          <w:sz w:val="22"/>
+          <w:szCs w:val="22"/>
+        </w:rPr>
+        <w:t xml:space="preserve"> b </w:t>
+      </w:r>
+      <w:proofErr w:type="gramStart"/>
+      <w:r>
+        <w:rPr>
+          <w:color w:val="0D0D0D" w:themeColor="text1" w:themeTint="F2"/>
+          <w:sz w:val="22"/>
+          <w:szCs w:val="22"/>
+        </w:rPr>
+        <w:t>[ c</w:t>
+      </w:r>
+      <w:proofErr w:type="gramEnd"/>
+      <w:r>
+        <w:rPr>
+          <w:color w:val="0D0D0D" w:themeColor="text1" w:themeTint="F2"/>
+          <w:sz w:val="22"/>
+          <w:szCs w:val="22"/>
+        </w:rPr>
+        <w:t xml:space="preserve"> i </w:t>
+      </w:r>
+      <w:proofErr w:type="spellStart"/>
+      <w:proofErr w:type="gramStart"/>
+      <w:r>
+        <w:rPr>
+          <w:color w:val="0D0D0D" w:themeColor="text1" w:themeTint="F2"/>
+          <w:sz w:val="22"/>
+          <w:szCs w:val="22"/>
+        </w:rPr>
+        <w:t>i</w:t>
+      </w:r>
+      <w:proofErr w:type="spellEnd"/>
+      <w:r>
+        <w:rPr>
+          <w:color w:val="0D0D0D" w:themeColor="text1" w:themeTint="F2"/>
+          <w:sz w:val="22"/>
+          <w:szCs w:val="22"/>
+        </w:rPr>
+        <w:t xml:space="preserve"> ]</w:t>
+      </w:r>
+      <w:proofErr w:type="gramEnd"/>
+      <w:r>
+        <w:rPr>
+          <w:color w:val="0D0D0D" w:themeColor="text1" w:themeTint="F2"/>
+          <w:sz w:val="22"/>
+          <w:szCs w:val="22"/>
+        </w:rPr>
+        <w:t xml:space="preserve"> i d e f</w:t>
+      </w:r>
+    </w:p>
+    <w:p>
+      <w:pPr>
+        <w:pStyle w:val="Balk1"/>
+        <w:spacing w:before="300" w:after="150"/>
+        <w:rPr>
+          <w:color w:val="0D0D0D" w:themeColor="text1" w:themeTint="F2"/>
+          <w:sz w:val="22"/>
+          <w:szCs w:val="22"/>
+        </w:rPr>
+      </w:pPr>
+      <w:proofErr w:type="gramStart"/>
+      <w:r>
+        <w:rPr>
+          <w:color w:val="0D0D0D" w:themeColor="text1" w:themeTint="F2"/>
+          <w:sz w:val="22"/>
+          <w:szCs w:val="22"/>
+        </w:rPr>
+        <w:t>b</w:t>
+      </w:r>
+      <w:proofErr w:type="gramEnd"/>
+      <w:r>
+        <w:rPr>
+          <w:color w:val="0D0D0D" w:themeColor="text1" w:themeTint="F2"/>
+          <w:sz w:val="22"/>
+          <w:szCs w:val="22"/>
+        </w:rPr>
+        <w:t xml:space="preserve"> çıkar ve i girer. </w:t>
+      </w:r>
+      <w:proofErr w:type="gramStart"/>
+      <w:r>
+        <w:rPr>
+          <w:color w:val="0D0D0D" w:themeColor="text1" w:themeTint="F2"/>
+          <w:sz w:val="22"/>
+          <w:szCs w:val="22"/>
+        </w:rPr>
+        <w:t>b</w:t>
+      </w:r>
+      <w:proofErr w:type="gramEnd"/>
+      <w:r>
+        <w:rPr>
+          <w:color w:val="0D0D0D" w:themeColor="text1" w:themeTint="F2"/>
+          <w:sz w:val="22"/>
+          <w:szCs w:val="22"/>
+        </w:rPr>
+        <w:t xml:space="preserve"> sessiz, i sesli olduğu için sesli harf sayısı 2 olur.</w:t>
+      </w:r>
+    </w:p>
+    <w:p>
+      <w:pPr>
+        <w:pStyle w:val="Balk1"/>
+        <w:spacing w:before="300" w:after="150"/>
+        <w:rPr>
+          <w:color w:val="0D0D0D" w:themeColor="text1" w:themeTint="F2"/>
+          <w:sz w:val="22"/>
+          <w:szCs w:val="22"/>
+        </w:rPr>
+      </w:pPr>
+      <w:r>
+        <w:rPr>
+          <w:color w:val="0D0D0D" w:themeColor="text1" w:themeTint="F2"/>
+          <w:sz w:val="22"/>
+          <w:szCs w:val="22"/>
+        </w:rPr>
+        <w:t>Bir sonraki kaydırmada:</w:t>
+      </w:r>
+    </w:p>
+    <w:p>
+      <w:pPr>
+        <w:pStyle w:val="Balk1"/>
+        <w:spacing w:before="300" w:after="150"/>
+        <w:rPr>
+          <w:color w:val="0D0D0D" w:themeColor="text1" w:themeTint="F2"/>
+          <w:sz w:val="22"/>
+          <w:szCs w:val="22"/>
+        </w:rPr>
+      </w:pPr>
+      <w:proofErr w:type="gramStart"/>
+      <w:r>
+        <w:rPr>
+          <w:color w:val="0D0D0D" w:themeColor="text1" w:themeTint="F2"/>
+          <w:sz w:val="22"/>
+          <w:szCs w:val="22"/>
+        </w:rPr>
+        <w:t>a</w:t>
+      </w:r>
+      <w:proofErr w:type="gramEnd"/>
+      <w:r>
+        <w:rPr>
+          <w:color w:val="0D0D0D" w:themeColor="text1" w:themeTint="F2"/>
+          <w:sz w:val="22"/>
+          <w:szCs w:val="22"/>
+        </w:rPr>
+        <w:t xml:space="preserve"> b c </w:t>
+      </w:r>
+      <w:proofErr w:type="gramStart"/>
+      <w:r>
+        <w:rPr>
+          <w:color w:val="0D0D0D" w:themeColor="text1" w:themeTint="F2"/>
+          <w:sz w:val="22"/>
+          <w:szCs w:val="22"/>
+        </w:rPr>
+        <w:t>[ i</w:t>
+      </w:r>
+      <w:proofErr w:type="gramEnd"/>
+      <w:r>
+        <w:rPr>
+          <w:color w:val="0D0D0D" w:themeColor="text1" w:themeTint="F2"/>
+          <w:sz w:val="22"/>
+          <w:szCs w:val="22"/>
+        </w:rPr>
+        <w:t xml:space="preserve"> </w:t>
+      </w:r>
+      <w:proofErr w:type="spellStart"/>
+      <w:r>
+        <w:rPr>
+          <w:color w:val="0D0D0D" w:themeColor="text1" w:themeTint="F2"/>
+          <w:sz w:val="22"/>
+          <w:szCs w:val="22"/>
+        </w:rPr>
+        <w:t>i</w:t>
+      </w:r>
+      <w:proofErr w:type="spellEnd"/>
+      <w:r>
+        <w:rPr>
+          <w:color w:val="0D0D0D" w:themeColor="text1" w:themeTint="F2"/>
+          <w:sz w:val="22"/>
+          <w:szCs w:val="22"/>
+        </w:rPr>
+        <w:t xml:space="preserve"> </w:t>
+      </w:r>
+      <w:proofErr w:type="spellStart"/>
+      <w:proofErr w:type="gramStart"/>
+      <w:r>
+        <w:rPr>
+          <w:color w:val="0D0D0D" w:themeColor="text1" w:themeTint="F2"/>
+          <w:sz w:val="22"/>
+          <w:szCs w:val="22"/>
+        </w:rPr>
+        <w:t>i</w:t>
+      </w:r>
+      <w:proofErr w:type="spellEnd"/>
+      <w:r>
+        <w:rPr>
+          <w:color w:val="0D0D0D" w:themeColor="text1" w:themeTint="F2"/>
+          <w:sz w:val="22"/>
+          <w:szCs w:val="22"/>
+        </w:rPr>
+        <w:t xml:space="preserve"> ]</w:t>
+      </w:r>
+      <w:proofErr w:type="gramEnd"/>
+      <w:r>
+        <w:rPr>
+          <w:color w:val="0D0D0D" w:themeColor="text1" w:themeTint="F2"/>
+          <w:sz w:val="22"/>
+          <w:szCs w:val="22"/>
+        </w:rPr>
+        <w:t xml:space="preserve"> d e f</w:t>
+      </w:r>
+    </w:p>
+    <w:p>
+      <w:pPr>
+        <w:pStyle w:val="Balk1"/>
+        <w:spacing w:before="300" w:after="150"/>
+        <w:rPr>
+          <w:color w:val="0D0D0D" w:themeColor="text1" w:themeTint="F2"/>
+          <w:sz w:val="22"/>
+          <w:szCs w:val="22"/>
+        </w:rPr>
+      </w:pPr>
+      <w:proofErr w:type="gramStart"/>
+      <w:r>
+        <w:rPr>
+          <w:color w:val="0D0D0D" w:themeColor="text1" w:themeTint="F2"/>
+          <w:sz w:val="22"/>
+          <w:szCs w:val="22"/>
+        </w:rPr>
+        <w:t>c</w:t>
+      </w:r>
+      <w:proofErr w:type="gramEnd"/>
+      <w:r>
+        <w:rPr>
+          <w:color w:val="0D0D0D" w:themeColor="text1" w:themeTint="F2"/>
+          <w:sz w:val="22"/>
+          <w:szCs w:val="22"/>
+        </w:rPr>
+        <w:t xml:space="preserve"> çıkar ve i girer. </w:t>
+      </w:r>
+      <w:proofErr w:type="gramStart"/>
+      <w:r>
+        <w:rPr>
+          <w:color w:val="0D0D0D" w:themeColor="text1" w:themeTint="F2"/>
+          <w:sz w:val="22"/>
+          <w:szCs w:val="22"/>
+        </w:rPr>
+        <w:t>c</w:t>
+      </w:r>
+      <w:proofErr w:type="gramEnd"/>
+      <w:r>
+        <w:rPr>
+          <w:color w:val="0D0D0D" w:themeColor="text1" w:themeTint="F2"/>
+          <w:sz w:val="22"/>
+          <w:szCs w:val="22"/>
+        </w:rPr>
+        <w:t xml:space="preserve"> sessiz olduğu için sayı değişmez ve yeni i sesli olduğu için sayı 3 olur.</w:t>
+      </w:r>
+    </w:p>
+    <w:p>
+      <w:pPr>
+        <w:pStyle w:val="Balk1"/>
+        <w:spacing w:before="300" w:after="150"/>
+        <w:rPr>
+          <w:color w:val="0D0D0D" w:themeColor="text1" w:themeTint="F2"/>
+          <w:sz w:val="22"/>
+          <w:szCs w:val="22"/>
+        </w:rPr>
+      </w:pPr>
+      <w:r>
+        <w:rPr>
+          <w:color w:val="0D0D0D" w:themeColor="text1" w:themeTint="F2"/>
+          <w:sz w:val="22"/>
+          <w:szCs w:val="22"/>
+        </w:rPr>
+        <w:t>Sonraki pencerelerde de aynı işlem uygulanır:</w:t>
+      </w:r>
+    </w:p>
+    <w:p>
+      <w:pPr>
+        <w:pStyle w:val="Balk1"/>
+        <w:spacing w:before="300" w:after="150"/>
+        <w:rPr>
+          <w:color w:val="0D0D0D" w:themeColor="text1" w:themeTint="F2"/>
+          <w:sz w:val="22"/>
+          <w:szCs w:val="22"/>
+        </w:rPr>
+      </w:pPr>
+      <w:proofErr w:type="gramStart"/>
+      <w:r>
+        <w:rPr>
+          <w:color w:val="0D0D0D" w:themeColor="text1" w:themeTint="F2"/>
+          <w:sz w:val="22"/>
+          <w:szCs w:val="22"/>
+        </w:rPr>
+        <w:t>a</w:t>
+      </w:r>
+      <w:proofErr w:type="gramEnd"/>
+      <w:r>
+        <w:rPr>
+          <w:color w:val="0D0D0D" w:themeColor="text1" w:themeTint="F2"/>
+          <w:sz w:val="22"/>
+          <w:szCs w:val="22"/>
+        </w:rPr>
+        <w:t xml:space="preserve"> b c i </w:t>
+      </w:r>
+      <w:proofErr w:type="gramStart"/>
+      <w:r>
+        <w:rPr>
+          <w:color w:val="0D0D0D" w:themeColor="text1" w:themeTint="F2"/>
+          <w:sz w:val="22"/>
+          <w:szCs w:val="22"/>
+        </w:rPr>
+        <w:t>[ i</w:t>
+      </w:r>
+      <w:proofErr w:type="gramEnd"/>
+      <w:r>
+        <w:rPr>
+          <w:color w:val="0D0D0D" w:themeColor="text1" w:themeTint="F2"/>
+          <w:sz w:val="22"/>
+          <w:szCs w:val="22"/>
+        </w:rPr>
+        <w:t xml:space="preserve"> </w:t>
+      </w:r>
+      <w:proofErr w:type="spellStart"/>
+      <w:r>
+        <w:rPr>
+          <w:color w:val="0D0D0D" w:themeColor="text1" w:themeTint="F2"/>
+          <w:sz w:val="22"/>
+          <w:szCs w:val="22"/>
+        </w:rPr>
+        <w:t>i</w:t>
+      </w:r>
+      <w:proofErr w:type="spellEnd"/>
+      <w:r>
+        <w:rPr>
+          <w:color w:val="0D0D0D" w:themeColor="text1" w:themeTint="F2"/>
+          <w:sz w:val="22"/>
+          <w:szCs w:val="22"/>
+        </w:rPr>
+        <w:t xml:space="preserve"> </w:t>
+      </w:r>
+      <w:proofErr w:type="gramStart"/>
+      <w:r>
+        <w:rPr>
+          <w:color w:val="0D0D0D" w:themeColor="text1" w:themeTint="F2"/>
+          <w:sz w:val="22"/>
+          <w:szCs w:val="22"/>
+        </w:rPr>
+        <w:t>d ]</w:t>
+      </w:r>
+      <w:proofErr w:type="gramEnd"/>
+      <w:r>
+        <w:rPr>
+          <w:color w:val="0D0D0D" w:themeColor="text1" w:themeTint="F2"/>
+          <w:sz w:val="22"/>
+          <w:szCs w:val="22"/>
+        </w:rPr>
+        <w:t xml:space="preserve"> e </w:t>
+      </w:r>
+      <w:proofErr w:type="gramStart"/>
+      <w:r>
+        <w:rPr>
+          <w:color w:val="0D0D0D" w:themeColor="text1" w:themeTint="F2"/>
+          <w:sz w:val="22"/>
+          <w:szCs w:val="22"/>
+        </w:rPr>
+        <w:t>f  →</w:t>
+      </w:r>
+      <w:proofErr w:type="gramEnd"/>
+      <w:r>
+        <w:rPr>
+          <w:color w:val="0D0D0D" w:themeColor="text1" w:themeTint="F2"/>
+          <w:sz w:val="22"/>
+          <w:szCs w:val="22"/>
+        </w:rPr>
+        <w:t xml:space="preserve"> 2</w:t>
+      </w:r>
+    </w:p>
+    <w:p>
+      <w:pPr>
+        <w:pStyle w:val="Balk1"/>
+        <w:spacing w:before="300" w:after="150"/>
+        <w:rPr>
+          <w:color w:val="0D0D0D" w:themeColor="text1" w:themeTint="F2"/>
+          <w:sz w:val="22"/>
+          <w:szCs w:val="22"/>
+        </w:rPr>
+      </w:pPr>
+      <w:proofErr w:type="gramStart"/>
+      <w:r>
+        <w:rPr>
+          <w:color w:val="0D0D0D" w:themeColor="text1" w:themeTint="F2"/>
+          <w:sz w:val="22"/>
+          <w:szCs w:val="22"/>
+        </w:rPr>
+        <w:t>a</w:t>
+      </w:r>
+      <w:proofErr w:type="gramEnd"/>
+      <w:r>
+        <w:rPr>
+          <w:color w:val="0D0D0D" w:themeColor="text1" w:themeTint="F2"/>
+          <w:sz w:val="22"/>
+          <w:szCs w:val="22"/>
+        </w:rPr>
+        <w:t xml:space="preserve"> b c i </w:t>
+      </w:r>
+      <w:proofErr w:type="spellStart"/>
+      <w:r>
+        <w:rPr>
+          <w:color w:val="0D0D0D" w:themeColor="text1" w:themeTint="F2"/>
+          <w:sz w:val="22"/>
+          <w:szCs w:val="22"/>
+        </w:rPr>
+        <w:t>i</w:t>
+      </w:r>
+      <w:proofErr w:type="spellEnd"/>
+      <w:r>
+        <w:rPr>
+          <w:color w:val="0D0D0D" w:themeColor="text1" w:themeTint="F2"/>
+          <w:sz w:val="22"/>
+          <w:szCs w:val="22"/>
+        </w:rPr>
+        <w:t xml:space="preserve"> </w:t>
+      </w:r>
+      <w:proofErr w:type="gramStart"/>
+      <w:r>
+        <w:rPr>
+          <w:color w:val="0D0D0D" w:themeColor="text1" w:themeTint="F2"/>
+          <w:sz w:val="22"/>
+          <w:szCs w:val="22"/>
+        </w:rPr>
+        <w:t>[ i</w:t>
+      </w:r>
+      <w:proofErr w:type="gramEnd"/>
+      <w:r>
+        <w:rPr>
+          <w:color w:val="0D0D0D" w:themeColor="text1" w:themeTint="F2"/>
+          <w:sz w:val="22"/>
+          <w:szCs w:val="22"/>
+        </w:rPr>
+        <w:t xml:space="preserve"> d </w:t>
+      </w:r>
+      <w:proofErr w:type="gramStart"/>
+      <w:r>
+        <w:rPr>
+          <w:color w:val="0D0D0D" w:themeColor="text1" w:themeTint="F2"/>
+          <w:sz w:val="22"/>
+          <w:szCs w:val="22"/>
+        </w:rPr>
+        <w:t>e ]</w:t>
+      </w:r>
+      <w:proofErr w:type="gramEnd"/>
+      <w:r>
+        <w:rPr>
+          <w:color w:val="0D0D0D" w:themeColor="text1" w:themeTint="F2"/>
+          <w:sz w:val="22"/>
+          <w:szCs w:val="22"/>
+        </w:rPr>
+        <w:t xml:space="preserve"> </w:t>
+      </w:r>
+      <w:proofErr w:type="gramStart"/>
+      <w:r>
+        <w:rPr>
+          <w:color w:val="0D0D0D" w:themeColor="text1" w:themeTint="F2"/>
+          <w:sz w:val="22"/>
+          <w:szCs w:val="22"/>
+        </w:rPr>
+        <w:t>f  →</w:t>
+      </w:r>
+      <w:proofErr w:type="gramEnd"/>
+      <w:r>
+        <w:rPr>
+          <w:color w:val="0D0D0D" w:themeColor="text1" w:themeTint="F2"/>
+          <w:sz w:val="22"/>
+          <w:szCs w:val="22"/>
+        </w:rPr>
+        <w:t xml:space="preserve"> 2</w:t>
+      </w:r>
+    </w:p>
+    <w:p>
+      <w:pPr>
+        <w:pStyle w:val="Balk1"/>
+        <w:spacing w:before="300" w:after="150"/>
+        <w:rPr>
+          <w:color w:val="0D0D0D" w:themeColor="text1" w:themeTint="F2"/>
+          <w:sz w:val="22"/>
+          <w:szCs w:val="22"/>
+        </w:rPr>
+      </w:pPr>
+      <w:proofErr w:type="gramStart"/>
+      <w:r>
+        <w:rPr>
+          <w:color w:val="0D0D0D" w:themeColor="text1" w:themeTint="F2"/>
+          <w:sz w:val="22"/>
+          <w:szCs w:val="22"/>
+        </w:rPr>
+        <w:t>a</w:t>
+      </w:r>
+      <w:proofErr w:type="gramEnd"/>
+      <w:r>
+        <w:rPr>
+          <w:color w:val="0D0D0D" w:themeColor="text1" w:themeTint="F2"/>
+          <w:sz w:val="22"/>
+          <w:szCs w:val="22"/>
+        </w:rPr>
+        <w:t xml:space="preserve"> b c i </w:t>
+      </w:r>
+      <w:proofErr w:type="spellStart"/>
+      <w:r>
+        <w:rPr>
+          <w:color w:val="0D0D0D" w:themeColor="text1" w:themeTint="F2"/>
+          <w:sz w:val="22"/>
+          <w:szCs w:val="22"/>
+        </w:rPr>
+        <w:t>i</w:t>
+      </w:r>
+      <w:proofErr w:type="spellEnd"/>
+      <w:r>
+        <w:rPr>
+          <w:color w:val="0D0D0D" w:themeColor="text1" w:themeTint="F2"/>
+          <w:sz w:val="22"/>
+          <w:szCs w:val="22"/>
+        </w:rPr>
+        <w:t xml:space="preserve"> </w:t>
+      </w:r>
+      <w:proofErr w:type="spellStart"/>
+      <w:r>
+        <w:rPr>
+          <w:color w:val="0D0D0D" w:themeColor="text1" w:themeTint="F2"/>
+          <w:sz w:val="22"/>
+          <w:szCs w:val="22"/>
+        </w:rPr>
+        <w:t>i</w:t>
+      </w:r>
+      <w:proofErr w:type="spellEnd"/>
+      <w:r>
+        <w:rPr>
+          <w:color w:val="0D0D0D" w:themeColor="text1" w:themeTint="F2"/>
+          <w:sz w:val="22"/>
+          <w:szCs w:val="22"/>
+        </w:rPr>
+        <w:t xml:space="preserve"> </w:t>
+      </w:r>
+      <w:proofErr w:type="gramStart"/>
+      <w:r>
+        <w:rPr>
+          <w:color w:val="0D0D0D" w:themeColor="text1" w:themeTint="F2"/>
+          <w:sz w:val="22"/>
+          <w:szCs w:val="22"/>
+        </w:rPr>
+        <w:t>[ d</w:t>
+      </w:r>
+      <w:proofErr w:type="gramEnd"/>
+      <w:r>
+        <w:rPr>
+          <w:color w:val="0D0D0D" w:themeColor="text1" w:themeTint="F2"/>
+          <w:sz w:val="22"/>
+          <w:szCs w:val="22"/>
+        </w:rPr>
+        <w:t xml:space="preserve"> e </w:t>
+      </w:r>
+      <w:proofErr w:type="gramStart"/>
+      <w:r>
+        <w:rPr>
+          <w:color w:val="0D0D0D" w:themeColor="text1" w:themeTint="F2"/>
+          <w:sz w:val="22"/>
+          <w:szCs w:val="22"/>
+        </w:rPr>
+        <w:t>f ]</w:t>
+      </w:r>
+      <w:proofErr w:type="gramEnd"/>
+      <w:r>
+        <w:rPr>
+          <w:color w:val="0D0D0D" w:themeColor="text1" w:themeTint="F2"/>
+          <w:sz w:val="22"/>
+          <w:szCs w:val="22"/>
+        </w:rPr>
+        <w:t xml:space="preserve">  → 1</w:t>
+      </w:r>
+    </w:p>
+    <w:p>
+      <w:pPr>
+        <w:pStyle w:val="Balk1"/>
+        <w:spacing w:before="300" w:after="150"/>
+        <w:rPr>
+          <w:color w:val="0D0D0D" w:themeColor="text1" w:themeTint="F2"/>
+          <w:sz w:val="22"/>
+          <w:szCs w:val="22"/>
+        </w:rPr>
+      </w:pPr>
+      <w:r>
+        <w:rPr>
+          <w:color w:val="0D0D0D" w:themeColor="text1" w:themeTint="F2"/>
+          <w:sz w:val="22"/>
+          <w:szCs w:val="22"/>
+        </w:rPr>
+        <w:t>Pencereler içerisindeki en yüksek sesli harf sayısı 3 olduğu için sonuç 3 olarak bulunur.</w:t>
+      </w:r>
+    </w:p>
+    <w:p>
+      <w:pPr>
+        <w:pStyle w:val="Balk1"/>
+        <w:spacing w:before="300" w:after="150"/>
+        <w:rPr>
+          <w:color w:val="0D0D0D" w:themeColor="text1" w:themeTint="F2"/>
+          <w:sz w:val="22"/>
+          <w:szCs w:val="22"/>
+        </w:rPr>
+      </w:pPr>
+      <w:r>
+        <w:rPr>
+          <w:color w:val="0D0D0D" w:themeColor="text1" w:themeTint="F2"/>
+          <w:sz w:val="22"/>
+          <w:szCs w:val="22"/>
+        </w:rPr>
+        <w:t xml:space="preserve">Bu uygulamada her pencereyi baştan taramak yerine yalnızca pencereden çıkan ve pencereye giren karakterler kontrol edilmiştir. Böylece </w:t>
+      </w:r>
+      <w:proofErr w:type="spellStart"/>
+      <w:r>
+        <w:rPr>
+          <w:color w:val="0D0D0D" w:themeColor="text1" w:themeTint="F2"/>
+          <w:sz w:val="22"/>
+          <w:szCs w:val="22"/>
+        </w:rPr>
+        <w:t>Sliding</w:t>
+      </w:r>
+      <w:proofErr w:type="spellEnd"/>
+      <w:r>
+        <w:rPr>
+          <w:color w:val="0D0D0D" w:themeColor="text1" w:themeTint="F2"/>
+          <w:sz w:val="22"/>
+          <w:szCs w:val="22"/>
+        </w:rPr>
+        <w:t xml:space="preserve"> </w:t>
+      </w:r>
+      <w:proofErr w:type="spellStart"/>
+      <w:r>
+        <w:rPr>
+          <w:color w:val="0D0D0D" w:themeColor="text1" w:themeTint="F2"/>
+          <w:sz w:val="22"/>
+          <w:szCs w:val="22"/>
+        </w:rPr>
+        <w:t>Window</w:t>
+      </w:r>
+      <w:proofErr w:type="spellEnd"/>
+      <w:r>
+        <w:rPr>
+          <w:color w:val="0D0D0D" w:themeColor="text1" w:themeTint="F2"/>
+          <w:sz w:val="22"/>
+          <w:szCs w:val="22"/>
+        </w:rPr>
+        <w:t xml:space="preserve"> tekniği kullanılarak işlem daha verimli hale getirilmiştir.</w:t>
+      </w:r>
+    </w:p>
+    <w:p>
+      <w:pPr>
+        <w:pStyle w:val="Balk1"/>
+        <w:spacing w:before="300" w:after="150"/>
+        <w:rPr>
+          <w:color w:val="0D0D0D" w:themeColor="text1" w:themeTint="F2"/>
+        </w:rPr>
+      </w:pPr>
+    </w:p>
+    <w:p>
+      <w:pPr>
+        <w:pStyle w:val="Balk1"/>
+        <w:spacing w:before="300" w:after="150"/>
+        <w:rPr>
+          <w:color w:val="0D0D0D" w:themeColor="text1" w:themeTint="F2"/>
+        </w:rPr>
+      </w:pPr>
+      <w:r>
+        <w:rPr>
+          <w:color w:val="0D0D0D" w:themeColor="text1" w:themeTint="F2"/>
+        </w:rPr>
+        <w:t>3</w:t>
+      </w:r>
+      <w:r>
+        <w:rPr>
+          <w:color w:val="0D0D0D" w:themeColor="text1" w:themeTint="F2"/>
+        </w:rPr>
+        <w:t xml:space="preserve">. </w:t>
       </w:r>
       <w:proofErr w:type="spellStart"/>
       <w:r>
@@ -886,14 +2865,357 @@
         <w:pStyle w:val="Balk1"/>
         <w:spacing w:before="300" w:after="150"/>
         <w:rPr>
-          <w:color w:val="0D0D0D" w:themeColor="text1" w:themeTint="F2"/>
-        </w:rPr>
-      </w:pPr>
-      <w:r>
-        <w:rPr>
-          <w:color w:val="0D0D0D" w:themeColor="text1" w:themeTint="F2"/>
-        </w:rPr>
-        <w:t>3. Teknik Kaynak Özeti</w:t>
+          <w:rStyle w:val="Kpr"/>
+          <w:sz w:val="22"/>
+          <w:szCs w:val="22"/>
+          <w14:textFill>
+            <w14:solidFill>
+              <w14:srgbClr w14:val="0563C1">
+                <w14:lumMod w14:val="95000"/>
+                <w14:lumOff w14:val="5000"/>
+              </w14:srgbClr>
+            </w14:solidFill>
+          </w14:textFill>
+        </w:rPr>
+      </w:pPr>
+      <w:r>
+        <w:rPr>
+          <w:color w:val="0D0D0D" w:themeColor="text1" w:themeTint="F2"/>
+          <w:sz w:val="22"/>
+          <w:szCs w:val="22"/>
+        </w:rPr>
+        <w:fldChar w:fldCharType="begin"/>
+      </w:r>
+      <w:r>
+        <w:rPr>
+          <w:color w:val="0D0D0D" w:themeColor="text1" w:themeTint="F2"/>
+          <w:sz w:val="22"/>
+          <w:szCs w:val="22"/>
+        </w:rPr>
+        <w:instrText>HYPERLINK "https://leetcode.com/problems/two-sum-ii-input-array-is-sorted/description/"</w:instrText>
+      </w:r>
+      <w:r>
+        <w:rPr>
+          <w:color w:val="0D0D0D" w:themeColor="text1" w:themeTint="F2"/>
+          <w:sz w:val="22"/>
+          <w:szCs w:val="22"/>
+        </w:rPr>
+      </w:r>
+      <w:r>
+        <w:rPr>
+          <w:color w:val="0D0D0D" w:themeColor="text1" w:themeTint="F2"/>
+          <w:sz w:val="22"/>
+          <w:szCs w:val="22"/>
+        </w:rPr>
+        <w:fldChar w:fldCharType="separate"/>
+      </w:r>
+      <w:r>
+        <w:rPr>
+          <w:rStyle w:val="Kpr"/>
+          <w:sz w:val="22"/>
+          <w:szCs w:val="22"/>
+          <w14:textFill>
+            <w14:solidFill>
+              <w14:srgbClr w14:val="0563C1">
+                <w14:lumMod w14:val="95000"/>
+                <w14:lumOff w14:val="5000"/>
+              </w14:srgbClr>
+            </w14:solidFill>
+          </w14:textFill>
+        </w:rPr>
+        <w:t>2)</w:t>
+      </w:r>
+      <w:proofErr w:type="spellStart"/>
+      <w:r>
+        <w:rPr>
+          <w:rStyle w:val="Kpr"/>
+          <w:sz w:val="22"/>
+          <w:szCs w:val="22"/>
+          <w14:textFill>
+            <w14:solidFill>
+              <w14:srgbClr w14:val="0563C1">
+                <w14:lumMod w14:val="95000"/>
+                <w14:lumOff w14:val="5000"/>
+              </w14:srgbClr>
+            </w14:solidFill>
+          </w14:textFill>
+        </w:rPr>
+        <w:t>LeetCode</w:t>
+      </w:r>
+      <w:proofErr w:type="spellEnd"/>
+      <w:r>
+        <w:rPr>
+          <w:rStyle w:val="Kpr"/>
+          <w:sz w:val="22"/>
+          <w:szCs w:val="22"/>
+          <w14:textFill>
+            <w14:solidFill>
+              <w14:srgbClr w14:val="0563C1">
+                <w14:lumMod w14:val="95000"/>
+                <w14:lumOff w14:val="5000"/>
+              </w14:srgbClr>
+            </w14:solidFill>
+          </w14:textFill>
+        </w:rPr>
+        <w:t xml:space="preserve"> </w:t>
+      </w:r>
+      <w:r>
+        <w:rPr>
+          <w:rStyle w:val="Kpr"/>
+          <w:b/>
+          <w:bCs/>
+          <w:sz w:val="22"/>
+          <w:szCs w:val="22"/>
+          <w14:textFill>
+            <w14:solidFill>
+              <w14:srgbClr w14:val="0563C1">
+                <w14:lumMod w14:val="95000"/>
+                <w14:lumOff w14:val="5000"/>
+              </w14:srgbClr>
+            </w14:solidFill>
+          </w14:textFill>
+        </w:rPr>
+        <w:t xml:space="preserve">167. Two </w:t>
+      </w:r>
+      <w:proofErr w:type="spellStart"/>
+      <w:r>
+        <w:rPr>
+          <w:rStyle w:val="Kpr"/>
+          <w:b/>
+          <w:bCs/>
+          <w:sz w:val="22"/>
+          <w:szCs w:val="22"/>
+          <w14:textFill>
+            <w14:solidFill>
+              <w14:srgbClr w14:val="0563C1">
+                <w14:lumMod w14:val="95000"/>
+                <w14:lumOff w14:val="5000"/>
+              </w14:srgbClr>
+            </w14:solidFill>
+          </w14:textFill>
+        </w:rPr>
+        <w:t>Sum</w:t>
+      </w:r>
+      <w:proofErr w:type="spellEnd"/>
+      <w:r>
+        <w:rPr>
+          <w:rStyle w:val="Kpr"/>
+          <w:b/>
+          <w:bCs/>
+          <w:sz w:val="22"/>
+          <w:szCs w:val="22"/>
+          <w14:textFill>
+            <w14:solidFill>
+              <w14:srgbClr w14:val="0563C1">
+                <w14:lumMod w14:val="95000"/>
+                <w14:lumOff w14:val="5000"/>
+              </w14:srgbClr>
+            </w14:solidFill>
+          </w14:textFill>
+        </w:rPr>
+        <w:t xml:space="preserve"> </w:t>
+      </w:r>
+      <w:proofErr w:type="gramStart"/>
+      <w:r>
+        <w:rPr>
+          <w:rStyle w:val="Kpr"/>
+          <w:b/>
+          <w:bCs/>
+          <w:sz w:val="22"/>
+          <w:szCs w:val="22"/>
+          <w14:textFill>
+            <w14:solidFill>
+              <w14:srgbClr w14:val="0563C1">
+                <w14:lumMod w14:val="95000"/>
+                <w14:lumOff w14:val="5000"/>
+              </w14:srgbClr>
+            </w14:solidFill>
+          </w14:textFill>
+        </w:rPr>
+        <w:t>II -</w:t>
+      </w:r>
+      <w:proofErr w:type="gramEnd"/>
+      <w:r>
+        <w:rPr>
+          <w:rStyle w:val="Kpr"/>
+          <w:b/>
+          <w:bCs/>
+          <w:sz w:val="22"/>
+          <w:szCs w:val="22"/>
+          <w14:textFill>
+            <w14:solidFill>
+              <w14:srgbClr w14:val="0563C1">
+                <w14:lumMod w14:val="95000"/>
+                <w14:lumOff w14:val="5000"/>
+              </w14:srgbClr>
+            </w14:solidFill>
+          </w14:textFill>
+        </w:rPr>
+        <w:t xml:space="preserve"> </w:t>
+      </w:r>
+      <w:proofErr w:type="spellStart"/>
+      <w:r>
+        <w:rPr>
+          <w:rStyle w:val="Kpr"/>
+          <w:b/>
+          <w:bCs/>
+          <w:sz w:val="22"/>
+          <w:szCs w:val="22"/>
+          <w14:textFill>
+            <w14:solidFill>
+              <w14:srgbClr w14:val="0563C1">
+                <w14:lumMod w14:val="95000"/>
+                <w14:lumOff w14:val="5000"/>
+              </w14:srgbClr>
+            </w14:solidFill>
+          </w14:textFill>
+        </w:rPr>
+        <w:t>Input</w:t>
+      </w:r>
+      <w:proofErr w:type="spellEnd"/>
+      <w:r>
+        <w:rPr>
+          <w:rStyle w:val="Kpr"/>
+          <w:b/>
+          <w:bCs/>
+          <w:sz w:val="22"/>
+          <w:szCs w:val="22"/>
+          <w14:textFill>
+            <w14:solidFill>
+              <w14:srgbClr w14:val="0563C1">
+                <w14:lumMod w14:val="95000"/>
+                <w14:lumOff w14:val="5000"/>
+              </w14:srgbClr>
+            </w14:solidFill>
+          </w14:textFill>
+        </w:rPr>
+        <w:t xml:space="preserve"> </w:t>
+      </w:r>
+      <w:proofErr w:type="spellStart"/>
+      <w:r>
+        <w:rPr>
+          <w:rStyle w:val="Kpr"/>
+          <w:b/>
+          <w:bCs/>
+          <w:sz w:val="22"/>
+          <w:szCs w:val="22"/>
+          <w14:textFill>
+            <w14:solidFill>
+              <w14:srgbClr w14:val="0563C1">
+                <w14:lumMod w14:val="95000"/>
+                <w14:lumOff w14:val="5000"/>
+              </w14:srgbClr>
+            </w14:solidFill>
+          </w14:textFill>
+        </w:rPr>
+        <w:t>Array</w:t>
+      </w:r>
+      <w:proofErr w:type="spellEnd"/>
+      <w:r>
+        <w:rPr>
+          <w:rStyle w:val="Kpr"/>
+          <w:b/>
+          <w:bCs/>
+          <w:sz w:val="22"/>
+          <w:szCs w:val="22"/>
+          <w14:textFill>
+            <w14:solidFill>
+              <w14:srgbClr w14:val="0563C1">
+                <w14:lumMod w14:val="95000"/>
+                <w14:lumOff w14:val="5000"/>
+              </w14:srgbClr>
+            </w14:solidFill>
+          </w14:textFill>
+        </w:rPr>
+        <w:t xml:space="preserve"> Is </w:t>
+      </w:r>
+      <w:proofErr w:type="spellStart"/>
+      <w:proofErr w:type="gramStart"/>
+      <w:r>
+        <w:rPr>
+          <w:rStyle w:val="Kpr"/>
+          <w:b/>
+          <w:bCs/>
+          <w:sz w:val="22"/>
+          <w:szCs w:val="22"/>
+          <w14:textFill>
+            <w14:solidFill>
+              <w14:srgbClr w14:val="0563C1">
+                <w14:lumMod w14:val="95000"/>
+                <w14:lumOff w14:val="5000"/>
+              </w14:srgbClr>
+            </w14:solidFill>
+          </w14:textFill>
+        </w:rPr>
+        <w:t>Sorted</w:t>
+      </w:r>
+      <w:proofErr w:type="spellEnd"/>
+      <w:r>
+        <w:rPr>
+          <w:rStyle w:val="Kpr"/>
+          <w:sz w:val="22"/>
+          <w:szCs w:val="22"/>
+          <w14:textFill>
+            <w14:solidFill>
+              <w14:srgbClr w14:val="0563C1">
+                <w14:lumMod w14:val="95000"/>
+                <w14:lumOff w14:val="5000"/>
+              </w14:srgbClr>
+            </w14:solidFill>
+          </w14:textFill>
+        </w:rPr>
+        <w:t>(</w:t>
+      </w:r>
+      <w:proofErr w:type="spellStart"/>
+      <w:proofErr w:type="gramEnd"/>
+      <w:r>
+        <w:rPr>
+          <w:rStyle w:val="Kpr"/>
+          <w:sz w:val="22"/>
+          <w:szCs w:val="22"/>
+          <w14:textFill>
+            <w14:solidFill>
+              <w14:srgbClr w14:val="0563C1">
+                <w14:lumMod w14:val="95000"/>
+                <w14:lumOff w14:val="5000"/>
+              </w14:srgbClr>
+            </w14:solidFill>
+          </w14:textFill>
+        </w:rPr>
+        <w:t>Medium</w:t>
+      </w:r>
+      <w:proofErr w:type="spellEnd"/>
+      <w:r>
+        <w:rPr>
+          <w:rStyle w:val="Kpr"/>
+          <w:sz w:val="22"/>
+          <w:szCs w:val="22"/>
+          <w14:textFill>
+            <w14:solidFill>
+              <w14:srgbClr w14:val="0563C1">
+                <w14:lumMod w14:val="95000"/>
+                <w14:lumOff w14:val="5000"/>
+              </w14:srgbClr>
+            </w14:solidFill>
+          </w14:textFill>
+        </w:rPr>
+        <w:t>)</w:t>
+      </w:r>
+      <w:r>
+        <w:rPr>
+          <w:rStyle w:val="Kpr"/>
+          <w:sz w:val="22"/>
+          <w:szCs w:val="22"/>
+          <w14:textFill>
+            <w14:solidFill>
+              <w14:srgbClr w14:val="0563C1">
+                <w14:lumMod w14:val="95000"/>
+                <w14:lumOff w14:val="5000"/>
+              </w14:srgbClr>
+            </w14:solidFill>
+          </w14:textFill>
+        </w:rPr>
+        <w:t xml:space="preserve"> </w:t>
       </w:r>
     </w:p>
     <w:p>
@@ -902,13 +3224,1171 @@
         <w:spacing w:before="300" w:after="150"/>
         <w:rPr>
           <w:color w:val="0D0D0D" w:themeColor="text1" w:themeTint="F2"/>
-        </w:rPr>
-      </w:pPr>
-      <w:r>
-        <w:rPr>
-          <w:color w:val="0D0D0D" w:themeColor="text1" w:themeTint="F2"/>
-        </w:rPr>
-        <w:t>4. Uyku Takip Tablosu</w:t>
+          <w:sz w:val="22"/>
+          <w:szCs w:val="22"/>
+        </w:rPr>
+      </w:pPr>
+      <w:r>
+        <w:rPr>
+          <w:color w:val="0D0D0D" w:themeColor="text1" w:themeTint="F2"/>
+          <w:sz w:val="22"/>
+          <w:szCs w:val="22"/>
+        </w:rPr>
+        <w:fldChar w:fldCharType="end"/>
+      </w:r>
+      <w:r>
+        <w:rPr>
+          <w:color w:val="0D0D0D" w:themeColor="text1" w:themeTint="F2"/>
+          <w:sz w:val="22"/>
+          <w:szCs w:val="22"/>
+        </w:rPr>
+        <w:t xml:space="preserve">Bu problemde sıralı bir dizi verildiği için Two </w:t>
+      </w:r>
+      <w:proofErr w:type="spellStart"/>
+      <w:r>
+        <w:rPr>
+          <w:color w:val="0D0D0D" w:themeColor="text1" w:themeTint="F2"/>
+          <w:sz w:val="22"/>
+          <w:szCs w:val="22"/>
+        </w:rPr>
+        <w:t>Pointers</w:t>
+      </w:r>
+      <w:proofErr w:type="spellEnd"/>
+      <w:r>
+        <w:rPr>
+          <w:color w:val="0D0D0D" w:themeColor="text1" w:themeTint="F2"/>
+          <w:sz w:val="22"/>
+          <w:szCs w:val="22"/>
+        </w:rPr>
+        <w:t xml:space="preserve"> yöntemi kullanılmıştır. Dizinin başına sol, sonuna ise </w:t>
+      </w:r>
+      <w:proofErr w:type="spellStart"/>
+      <w:r>
+        <w:rPr>
+          <w:color w:val="0D0D0D" w:themeColor="text1" w:themeTint="F2"/>
+          <w:sz w:val="22"/>
+          <w:szCs w:val="22"/>
+        </w:rPr>
+        <w:t>sag</w:t>
+      </w:r>
+      <w:proofErr w:type="spellEnd"/>
+      <w:r>
+        <w:rPr>
+          <w:color w:val="0D0D0D" w:themeColor="text1" w:themeTint="F2"/>
+          <w:sz w:val="22"/>
+          <w:szCs w:val="22"/>
+        </w:rPr>
+        <w:t xml:space="preserve"> işaretçisi yerleştirilerek iki elemanın toplamı kontrol edilmiştir. Toplam </w:t>
+      </w:r>
+      <w:proofErr w:type="spellStart"/>
+      <w:r>
+        <w:rPr>
+          <w:color w:val="0D0D0D" w:themeColor="text1" w:themeTint="F2"/>
+          <w:sz w:val="22"/>
+          <w:szCs w:val="22"/>
+        </w:rPr>
+        <w:t>target</w:t>
+      </w:r>
+      <w:proofErr w:type="spellEnd"/>
+      <w:r>
+        <w:rPr>
+          <w:color w:val="0D0D0D" w:themeColor="text1" w:themeTint="F2"/>
+          <w:sz w:val="22"/>
+          <w:szCs w:val="22"/>
+        </w:rPr>
+        <w:t xml:space="preserve"> değerinden küçükse toplamı artırmak için sol sağa, büyükse toplamı azaltmak için </w:t>
+      </w:r>
+      <w:proofErr w:type="spellStart"/>
+      <w:r>
+        <w:rPr>
+          <w:color w:val="0D0D0D" w:themeColor="text1" w:themeTint="F2"/>
+          <w:sz w:val="22"/>
+          <w:szCs w:val="22"/>
+        </w:rPr>
+        <w:t>sag</w:t>
+      </w:r>
+      <w:proofErr w:type="spellEnd"/>
+      <w:r>
+        <w:rPr>
+          <w:color w:val="0D0D0D" w:themeColor="text1" w:themeTint="F2"/>
+          <w:sz w:val="22"/>
+          <w:szCs w:val="22"/>
+        </w:rPr>
+        <w:t xml:space="preserve"> sola kaydırılmıştır. Toplam </w:t>
+      </w:r>
+      <w:proofErr w:type="spellStart"/>
+      <w:r>
+        <w:rPr>
+          <w:color w:val="0D0D0D" w:themeColor="text1" w:themeTint="F2"/>
+          <w:sz w:val="22"/>
+          <w:szCs w:val="22"/>
+        </w:rPr>
+        <w:t>target</w:t>
+      </w:r>
+      <w:proofErr w:type="spellEnd"/>
+      <w:r>
+        <w:rPr>
+          <w:color w:val="0D0D0D" w:themeColor="text1" w:themeTint="F2"/>
+          <w:sz w:val="22"/>
+          <w:szCs w:val="22"/>
+        </w:rPr>
+        <w:t xml:space="preserve"> değerine eşit olduğunda iki elemanın indeksleri bulunarak döndürülmüştür. Dizinin indeksleri 0'dan başladığı için sonuç verirken indekslere 1 eklenmiştir. Bu yöntem diziyi yalnızca bir kez gezdiği için zaman karmaşıklığı </w:t>
+      </w:r>
+      <w:r>
+        <w:rPr>
+          <w:b/>
+          <w:bCs/>
+          <w:color w:val="0D0D0D" w:themeColor="text1" w:themeTint="F2"/>
+          <w:sz w:val="22"/>
+          <w:szCs w:val="22"/>
+        </w:rPr>
+        <w:t>O(n)</w:t>
+      </w:r>
+      <w:r>
+        <w:rPr>
+          <w:color w:val="0D0D0D" w:themeColor="text1" w:themeTint="F2"/>
+          <w:sz w:val="22"/>
+          <w:szCs w:val="22"/>
+        </w:rPr>
+        <w:t xml:space="preserve">, </w:t>
+      </w:r>
+      <w:r>
+        <w:rPr>
+          <w:color w:val="0D0D0D" w:themeColor="text1" w:themeTint="F2"/>
+          <w:sz w:val="22"/>
+          <w:szCs w:val="22"/>
+        </w:rPr>
+        <w:t>ayrıca</w:t>
+      </w:r>
+      <w:r>
+        <w:rPr>
+          <w:color w:val="0D0D0D" w:themeColor="text1" w:themeTint="F2"/>
+          <w:sz w:val="22"/>
+          <w:szCs w:val="22"/>
+        </w:rPr>
+        <w:t xml:space="preserve"> alan karmaşıklığı ise </w:t>
+      </w:r>
+      <w:proofErr w:type="gramStart"/>
+      <w:r>
+        <w:rPr>
+          <w:b/>
+          <w:bCs/>
+          <w:color w:val="0D0D0D" w:themeColor="text1" w:themeTint="F2"/>
+          <w:sz w:val="22"/>
+          <w:szCs w:val="22"/>
+        </w:rPr>
+        <w:t>O(</w:t>
+      </w:r>
+      <w:proofErr w:type="gramEnd"/>
+      <w:r>
+        <w:rPr>
+          <w:b/>
+          <w:bCs/>
+          <w:color w:val="0D0D0D" w:themeColor="text1" w:themeTint="F2"/>
+          <w:sz w:val="22"/>
+          <w:szCs w:val="22"/>
+        </w:rPr>
+        <w:t>1)</w:t>
+      </w:r>
+      <w:r>
+        <w:rPr>
+          <w:color w:val="0D0D0D" w:themeColor="text1" w:themeTint="F2"/>
+          <w:sz w:val="22"/>
+          <w:szCs w:val="22"/>
+        </w:rPr>
+        <w:t>'</w:t>
+      </w:r>
+      <w:proofErr w:type="spellStart"/>
+      <w:r>
+        <w:rPr>
+          <w:color w:val="0D0D0D" w:themeColor="text1" w:themeTint="F2"/>
+          <w:sz w:val="22"/>
+          <w:szCs w:val="22"/>
+        </w:rPr>
+        <w:t>dir</w:t>
+      </w:r>
+      <w:proofErr w:type="spellEnd"/>
+      <w:r>
+        <w:rPr>
+          <w:color w:val="0D0D0D" w:themeColor="text1" w:themeTint="F2"/>
+          <w:sz w:val="22"/>
+          <w:szCs w:val="22"/>
+        </w:rPr>
+        <w:t>.</w:t>
+      </w:r>
+    </w:p>
+    <w:p>
+      <w:pPr>
+        <w:pStyle w:val="Balk1"/>
+        <w:spacing w:before="300" w:after="150"/>
+        <w:rPr>
+          <w:color w:val="0D0D0D" w:themeColor="text1" w:themeTint="F2"/>
+          <w:sz w:val="22"/>
+          <w:szCs w:val="22"/>
+        </w:rPr>
+      </w:pPr>
+    </w:p>
+    <w:p>
+      <w:pPr>
+        <w:pStyle w:val="Balk1"/>
+        <w:spacing w:before="300" w:after="150"/>
+        <w:rPr>
+          <w:color w:val="0D0D0D" w:themeColor="text1" w:themeTint="F2"/>
+          <w:sz w:val="22"/>
+          <w:szCs w:val="22"/>
+        </w:rPr>
+      </w:pPr>
+      <w:hyperlink r:id="rId6" w:history="1">
+        <w:r>
+          <w:rPr>
+            <w:rStyle w:val="Kpr"/>
+            <w:sz w:val="22"/>
+            <w:szCs w:val="22"/>
+            <w14:textFill>
+              <w14:solidFill>
+                <w14:srgbClr w14:val="0563C1">
+                  <w14:lumMod w14:val="95000"/>
+                  <w14:lumOff w14:val="5000"/>
+                </w14:srgbClr>
+              </w14:solidFill>
+            </w14:textFill>
+          </w:rPr>
+          <w:t xml:space="preserve">3) </w:t>
+        </w:r>
+        <w:proofErr w:type="spellStart"/>
+        <w:r>
+          <w:rPr>
+            <w:rStyle w:val="Kpr"/>
+            <w:sz w:val="22"/>
+            <w:szCs w:val="22"/>
+            <w14:textFill>
+              <w14:solidFill>
+                <w14:srgbClr w14:val="0563C1">
+                  <w14:lumMod w14:val="95000"/>
+                  <w14:lumOff w14:val="5000"/>
+                </w14:srgbClr>
+              </w14:solidFill>
+            </w14:textFill>
+          </w:rPr>
+          <w:t>LeetCode</w:t>
+        </w:r>
+        <w:proofErr w:type="spellEnd"/>
+        <w:r>
+          <w:rPr>
+            <w:rStyle w:val="Kpr"/>
+            <w:sz w:val="22"/>
+            <w:szCs w:val="22"/>
+            <w14:textFill>
+              <w14:solidFill>
+                <w14:srgbClr w14:val="0563C1">
+                  <w14:lumMod w14:val="95000"/>
+                  <w14:lumOff w14:val="5000"/>
+                </w14:srgbClr>
+              </w14:solidFill>
+            </w14:textFill>
+          </w:rPr>
+          <w:t xml:space="preserve"> </w:t>
+        </w:r>
+        <w:proofErr w:type="gramStart"/>
+        <w:r>
+          <w:rPr>
+            <w:rStyle w:val="Kpr"/>
+            <w:sz w:val="22"/>
+            <w:szCs w:val="22"/>
+            <w14:textFill>
+              <w14:solidFill>
+                <w14:srgbClr w14:val="0563C1">
+                  <w14:lumMod w14:val="95000"/>
+                  <w14:lumOff w14:val="5000"/>
+                </w14:srgbClr>
+              </w14:solidFill>
+            </w14:textFill>
+          </w:rPr>
+          <w:t>1456 -</w:t>
+        </w:r>
+        <w:proofErr w:type="gramEnd"/>
+        <w:r>
+          <w:rPr>
+            <w:rStyle w:val="Kpr"/>
+            <w:sz w:val="22"/>
+            <w:szCs w:val="22"/>
+            <w14:textFill>
+              <w14:solidFill>
+                <w14:srgbClr w14:val="0563C1">
+                  <w14:lumMod w14:val="95000"/>
+                  <w14:lumOff w14:val="5000"/>
+                </w14:srgbClr>
+              </w14:solidFill>
+            </w14:textFill>
+          </w:rPr>
+          <w:t xml:space="preserve"> Maximum </w:t>
+        </w:r>
+        <w:proofErr w:type="spellStart"/>
+        <w:r>
+          <w:rPr>
+            <w:rStyle w:val="Kpr"/>
+            <w:sz w:val="22"/>
+            <w:szCs w:val="22"/>
+            <w14:textFill>
+              <w14:solidFill>
+                <w14:srgbClr w14:val="0563C1">
+                  <w14:lumMod w14:val="95000"/>
+                  <w14:lumOff w14:val="5000"/>
+                </w14:srgbClr>
+              </w14:solidFill>
+            </w14:textFill>
+          </w:rPr>
+          <w:t>Number</w:t>
+        </w:r>
+        <w:proofErr w:type="spellEnd"/>
+        <w:r>
+          <w:rPr>
+            <w:rStyle w:val="Kpr"/>
+            <w:sz w:val="22"/>
+            <w:szCs w:val="22"/>
+            <w14:textFill>
+              <w14:solidFill>
+                <w14:srgbClr w14:val="0563C1">
+                  <w14:lumMod w14:val="95000"/>
+                  <w14:lumOff w14:val="5000"/>
+                </w14:srgbClr>
+              </w14:solidFill>
+            </w14:textFill>
+          </w:rPr>
+          <w:t xml:space="preserve"> of </w:t>
+        </w:r>
+        <w:proofErr w:type="spellStart"/>
+        <w:r>
+          <w:rPr>
+            <w:rStyle w:val="Kpr"/>
+            <w:sz w:val="22"/>
+            <w:szCs w:val="22"/>
+            <w14:textFill>
+              <w14:solidFill>
+                <w14:srgbClr w14:val="0563C1">
+                  <w14:lumMod w14:val="95000"/>
+                  <w14:lumOff w14:val="5000"/>
+                </w14:srgbClr>
+              </w14:solidFill>
+            </w14:textFill>
+          </w:rPr>
+          <w:t>Vowels</w:t>
+        </w:r>
+        <w:proofErr w:type="spellEnd"/>
+        <w:r>
+          <w:rPr>
+            <w:rStyle w:val="Kpr"/>
+            <w:sz w:val="22"/>
+            <w:szCs w:val="22"/>
+            <w14:textFill>
+              <w14:solidFill>
+                <w14:srgbClr w14:val="0563C1">
+                  <w14:lumMod w14:val="95000"/>
+                  <w14:lumOff w14:val="5000"/>
+                </w14:srgbClr>
+              </w14:solidFill>
+            </w14:textFill>
+          </w:rPr>
+          <w:t xml:space="preserve"> in a </w:t>
+        </w:r>
+        <w:proofErr w:type="spellStart"/>
+        <w:r>
+          <w:rPr>
+            <w:rStyle w:val="Kpr"/>
+            <w:sz w:val="22"/>
+            <w:szCs w:val="22"/>
+            <w14:textFill>
+              <w14:solidFill>
+                <w14:srgbClr w14:val="0563C1">
+                  <w14:lumMod w14:val="95000"/>
+                  <w14:lumOff w14:val="5000"/>
+                </w14:srgbClr>
+              </w14:solidFill>
+            </w14:textFill>
+          </w:rPr>
+          <w:t>Substring</w:t>
+        </w:r>
+        <w:proofErr w:type="spellEnd"/>
+        <w:r>
+          <w:rPr>
+            <w:rStyle w:val="Kpr"/>
+            <w:sz w:val="22"/>
+            <w:szCs w:val="22"/>
+            <w14:textFill>
+              <w14:solidFill>
+                <w14:srgbClr w14:val="0563C1">
+                  <w14:lumMod w14:val="95000"/>
+                  <w14:lumOff w14:val="5000"/>
+                </w14:srgbClr>
+              </w14:solidFill>
+            </w14:textFill>
+          </w:rPr>
+          <w:t xml:space="preserve"> of </w:t>
+        </w:r>
+        <w:proofErr w:type="spellStart"/>
+        <w:r>
+          <w:rPr>
+            <w:rStyle w:val="Kpr"/>
+            <w:sz w:val="22"/>
+            <w:szCs w:val="22"/>
+            <w14:textFill>
+              <w14:solidFill>
+                <w14:srgbClr w14:val="0563C1">
+                  <w14:lumMod w14:val="95000"/>
+                  <w14:lumOff w14:val="5000"/>
+                </w14:srgbClr>
+              </w14:solidFill>
+            </w14:textFill>
+          </w:rPr>
+          <w:t>Given</w:t>
+        </w:r>
+        <w:proofErr w:type="spellEnd"/>
+        <w:r>
+          <w:rPr>
+            <w:rStyle w:val="Kpr"/>
+            <w:sz w:val="22"/>
+            <w:szCs w:val="22"/>
+            <w14:textFill>
+              <w14:solidFill>
+                <w14:srgbClr w14:val="0563C1">
+                  <w14:lumMod w14:val="95000"/>
+                  <w14:lumOff w14:val="5000"/>
+                </w14:srgbClr>
+              </w14:solidFill>
+            </w14:textFill>
+          </w:rPr>
+          <w:t xml:space="preserve"> </w:t>
+        </w:r>
+        <w:proofErr w:type="spellStart"/>
+        <w:r>
+          <w:rPr>
+            <w:rStyle w:val="Kpr"/>
+            <w:sz w:val="22"/>
+            <w:szCs w:val="22"/>
+            <w14:textFill>
+              <w14:solidFill>
+                <w14:srgbClr w14:val="0563C1">
+                  <w14:lumMod w14:val="95000"/>
+                  <w14:lumOff w14:val="5000"/>
+                </w14:srgbClr>
+              </w14:solidFill>
+            </w14:textFill>
+          </w:rPr>
+          <w:t>Length</w:t>
+        </w:r>
+        <w:proofErr w:type="spellEnd"/>
+        <w:r>
+          <w:rPr>
+            <w:rStyle w:val="Kpr"/>
+            <w:sz w:val="22"/>
+            <w:szCs w:val="22"/>
+            <w14:textFill>
+              <w14:solidFill>
+                <w14:srgbClr w14:val="0563C1">
+                  <w14:lumMod w14:val="95000"/>
+                  <w14:lumOff w14:val="5000"/>
+                </w14:srgbClr>
+              </w14:solidFill>
+            </w14:textFill>
+          </w:rPr>
+          <w:t xml:space="preserve"> (</w:t>
+        </w:r>
+        <w:proofErr w:type="spellStart"/>
+        <w:r>
+          <w:rPr>
+            <w:rStyle w:val="Kpr"/>
+            <w:sz w:val="22"/>
+            <w:szCs w:val="22"/>
+            <w14:textFill>
+              <w14:solidFill>
+                <w14:srgbClr w14:val="0563C1">
+                  <w14:lumMod w14:val="95000"/>
+                  <w14:lumOff w14:val="5000"/>
+                </w14:srgbClr>
+              </w14:solidFill>
+            </w14:textFill>
+          </w:rPr>
+          <w:t>Medium</w:t>
+        </w:r>
+        <w:proofErr w:type="spellEnd"/>
+        <w:r>
+          <w:rPr>
+            <w:rStyle w:val="Kpr"/>
+            <w:sz w:val="22"/>
+            <w:szCs w:val="22"/>
+            <w14:textFill>
+              <w14:solidFill>
+                <w14:srgbClr w14:val="0563C1">
+                  <w14:lumMod w14:val="95000"/>
+                  <w14:lumOff w14:val="5000"/>
+                </w14:srgbClr>
+              </w14:solidFill>
+            </w14:textFill>
+          </w:rPr>
+          <w:t>)</w:t>
+        </w:r>
+      </w:hyperlink>
+    </w:p>
+    <w:p>
+      <w:pPr>
+        <w:pStyle w:val="Balk1"/>
+        <w:rPr>
+          <w:color w:val="0D0D0D" w:themeColor="text1" w:themeTint="F2"/>
+          <w:sz w:val="22"/>
+          <w:szCs w:val="22"/>
+        </w:rPr>
+      </w:pPr>
+      <w:r>
+        <w:rPr>
+          <w:color w:val="0D0D0D" w:themeColor="text1" w:themeTint="F2"/>
+          <w:sz w:val="22"/>
+          <w:szCs w:val="22"/>
+        </w:rPr>
+        <w:t xml:space="preserve">    Bu problemde k uzunluğundaki bir pencere içerisindeki en fazla sesli harf sayısını bulmak için </w:t>
+      </w:r>
+      <w:proofErr w:type="spellStart"/>
+      <w:r>
+        <w:rPr>
+          <w:color w:val="0D0D0D" w:themeColor="text1" w:themeTint="F2"/>
+          <w:sz w:val="22"/>
+          <w:szCs w:val="22"/>
+        </w:rPr>
+        <w:t>Sliding</w:t>
+      </w:r>
+      <w:proofErr w:type="spellEnd"/>
+      <w:r>
+        <w:rPr>
+          <w:color w:val="0D0D0D" w:themeColor="text1" w:themeTint="F2"/>
+          <w:sz w:val="22"/>
+          <w:szCs w:val="22"/>
+        </w:rPr>
+        <w:t xml:space="preserve"> </w:t>
+      </w:r>
+      <w:proofErr w:type="spellStart"/>
+      <w:r>
+        <w:rPr>
+          <w:color w:val="0D0D0D" w:themeColor="text1" w:themeTint="F2"/>
+          <w:sz w:val="22"/>
+          <w:szCs w:val="22"/>
+        </w:rPr>
+        <w:t>Window</w:t>
+      </w:r>
+      <w:proofErr w:type="spellEnd"/>
+      <w:r>
+        <w:rPr>
+          <w:color w:val="0D0D0D" w:themeColor="text1" w:themeTint="F2"/>
+          <w:sz w:val="22"/>
+          <w:szCs w:val="22"/>
+        </w:rPr>
+        <w:t xml:space="preserve"> tekniği kullanıldı. İlk k karakterden oluşan pencerenin sesli harf sayısı </w:t>
+      </w:r>
+      <w:proofErr w:type="spellStart"/>
+      <w:r>
+        <w:rPr>
+          <w:color w:val="0D0D0D" w:themeColor="text1" w:themeTint="F2"/>
+          <w:sz w:val="22"/>
+          <w:szCs w:val="22"/>
+        </w:rPr>
+        <w:t>count</w:t>
+      </w:r>
+      <w:proofErr w:type="spellEnd"/>
+      <w:r>
+        <w:rPr>
+          <w:color w:val="0D0D0D" w:themeColor="text1" w:themeTint="F2"/>
+          <w:sz w:val="22"/>
+          <w:szCs w:val="22"/>
+        </w:rPr>
+        <w:t xml:space="preserve"> değişkeninde tutuldu. Pencere sağa doğru kaydırılırken pencereden çıkan karakter sesliyse </w:t>
+      </w:r>
+      <w:proofErr w:type="spellStart"/>
+      <w:r>
+        <w:rPr>
+          <w:color w:val="0D0D0D" w:themeColor="text1" w:themeTint="F2"/>
+          <w:sz w:val="22"/>
+          <w:szCs w:val="22"/>
+        </w:rPr>
+        <w:t>count</w:t>
+      </w:r>
+      <w:proofErr w:type="spellEnd"/>
+      <w:r>
+        <w:rPr>
+          <w:color w:val="0D0D0D" w:themeColor="text1" w:themeTint="F2"/>
+          <w:sz w:val="22"/>
+          <w:szCs w:val="22"/>
+        </w:rPr>
+        <w:t xml:space="preserve"> bir azaltıldı, pencereye yeni giren karakter sesliyse </w:t>
+      </w:r>
+      <w:proofErr w:type="spellStart"/>
+      <w:r>
+        <w:rPr>
+          <w:color w:val="0D0D0D" w:themeColor="text1" w:themeTint="F2"/>
+          <w:sz w:val="22"/>
+          <w:szCs w:val="22"/>
+        </w:rPr>
+        <w:t>count</w:t>
+      </w:r>
+      <w:proofErr w:type="spellEnd"/>
+      <w:r>
+        <w:rPr>
+          <w:color w:val="0D0D0D" w:themeColor="text1" w:themeTint="F2"/>
+          <w:sz w:val="22"/>
+          <w:szCs w:val="22"/>
+        </w:rPr>
+        <w:t xml:space="preserve"> bir artırıldı. Her adımda güncellenen </w:t>
+      </w:r>
+      <w:proofErr w:type="spellStart"/>
+      <w:r>
+        <w:rPr>
+          <w:color w:val="0D0D0D" w:themeColor="text1" w:themeTint="F2"/>
+          <w:sz w:val="22"/>
+          <w:szCs w:val="22"/>
+        </w:rPr>
+        <w:t>count</w:t>
+      </w:r>
+      <w:proofErr w:type="spellEnd"/>
+      <w:r>
+        <w:rPr>
+          <w:color w:val="0D0D0D" w:themeColor="text1" w:themeTint="F2"/>
+          <w:sz w:val="22"/>
+          <w:szCs w:val="22"/>
+        </w:rPr>
+        <w:t xml:space="preserve"> değeri </w:t>
+      </w:r>
+      <w:proofErr w:type="spellStart"/>
+      <w:r>
+        <w:rPr>
+          <w:color w:val="0D0D0D" w:themeColor="text1" w:themeTint="F2"/>
+          <w:sz w:val="22"/>
+          <w:szCs w:val="22"/>
+        </w:rPr>
+        <w:t>max_count</w:t>
+      </w:r>
+      <w:proofErr w:type="spellEnd"/>
+      <w:r>
+        <w:rPr>
+          <w:color w:val="0D0D0D" w:themeColor="text1" w:themeTint="F2"/>
+          <w:sz w:val="22"/>
+          <w:szCs w:val="22"/>
+        </w:rPr>
+        <w:t xml:space="preserve"> ile karşılaştırılarak en yüksek değer saklandı. Bu sayede her pencere baştan taranmadan, yalnızca pencereden çıkan ve giren tek karakter kontrol edilerek problem </w:t>
+      </w:r>
+      <w:r>
+        <w:rPr>
+          <w:b/>
+          <w:bCs/>
+          <w:color w:val="0D0D0D" w:themeColor="text1" w:themeTint="F2"/>
+          <w:sz w:val="22"/>
+          <w:szCs w:val="22"/>
+        </w:rPr>
+        <w:t>O(n)</w:t>
+      </w:r>
+      <w:r>
+        <w:rPr>
+          <w:color w:val="0D0D0D" w:themeColor="text1" w:themeTint="F2"/>
+          <w:sz w:val="22"/>
+          <w:szCs w:val="22"/>
+        </w:rPr>
+        <w:t xml:space="preserve"> zaman karmaşıklığında çözüldü. Alan karmaşıklığı ise </w:t>
+      </w:r>
+      <w:proofErr w:type="gramStart"/>
+      <w:r>
+        <w:rPr>
+          <w:b/>
+          <w:bCs/>
+          <w:color w:val="0D0D0D" w:themeColor="text1" w:themeTint="F2"/>
+          <w:sz w:val="22"/>
+          <w:szCs w:val="22"/>
+        </w:rPr>
+        <w:t>O(</w:t>
+      </w:r>
+      <w:proofErr w:type="gramEnd"/>
+      <w:r>
+        <w:rPr>
+          <w:b/>
+          <w:bCs/>
+          <w:color w:val="0D0D0D" w:themeColor="text1" w:themeTint="F2"/>
+          <w:sz w:val="22"/>
+          <w:szCs w:val="22"/>
+        </w:rPr>
+        <w:t>1)</w:t>
+      </w:r>
+      <w:r>
+        <w:rPr>
+          <w:color w:val="0D0D0D" w:themeColor="text1" w:themeTint="F2"/>
+          <w:sz w:val="22"/>
+          <w:szCs w:val="22"/>
+        </w:rPr>
+        <w:t>'</w:t>
+      </w:r>
+      <w:proofErr w:type="spellStart"/>
+      <w:r>
+        <w:rPr>
+          <w:color w:val="0D0D0D" w:themeColor="text1" w:themeTint="F2"/>
+          <w:sz w:val="22"/>
+          <w:szCs w:val="22"/>
+        </w:rPr>
+        <w:t>dir</w:t>
+      </w:r>
+      <w:proofErr w:type="spellEnd"/>
+      <w:r>
+        <w:rPr>
+          <w:color w:val="0D0D0D" w:themeColor="text1" w:themeTint="F2"/>
+          <w:sz w:val="22"/>
+          <w:szCs w:val="22"/>
+        </w:rPr>
+        <w:t>.</w:t>
+      </w:r>
+    </w:p>
+    <w:p>
+      <w:pPr>
+        <w:pStyle w:val="Balk1"/>
+        <w:spacing w:before="300" w:after="150"/>
+        <w:rPr>
+          <w:rStyle w:val="Kpr"/>
+          <w:sz w:val="22"/>
+          <w:szCs w:val="22"/>
+        </w:rPr>
+      </w:pPr>
+      <w:r>
+        <w:rPr>
+          <w:color w:val="0D0D0D" w:themeColor="text1" w:themeTint="F2"/>
+          <w:sz w:val="22"/>
+          <w:szCs w:val="22"/>
+        </w:rPr>
+        <w:fldChar w:fldCharType="begin"/>
+      </w:r>
+      <w:r>
+        <w:rPr>
+          <w:color w:val="0D0D0D" w:themeColor="text1" w:themeTint="F2"/>
+          <w:sz w:val="22"/>
+          <w:szCs w:val="22"/>
+        </w:rPr>
+        <w:instrText>HYPERLINK "https://leetcode.com/problems/power-of-four/description/"</w:instrText>
+      </w:r>
+      <w:r>
+        <w:rPr>
+          <w:color w:val="0D0D0D" w:themeColor="text1" w:themeTint="F2"/>
+          <w:sz w:val="22"/>
+          <w:szCs w:val="22"/>
+        </w:rPr>
+      </w:r>
+      <w:r>
+        <w:rPr>
+          <w:color w:val="0D0D0D" w:themeColor="text1" w:themeTint="F2"/>
+          <w:sz w:val="22"/>
+          <w:szCs w:val="22"/>
+        </w:rPr>
+        <w:fldChar w:fldCharType="separate"/>
+      </w:r>
+      <w:r>
+        <w:rPr>
+          <w:rStyle w:val="Kpr"/>
+          <w:sz w:val="22"/>
+          <w:szCs w:val="22"/>
+        </w:rPr>
+        <w:t>4)</w:t>
+      </w:r>
+      <w:r>
+        <w:rPr>
+          <w:rStyle w:val="Kpr"/>
+          <w:sz w:val="20"/>
+          <w:szCs w:val="20"/>
+        </w:rPr>
+        <w:t xml:space="preserve"> </w:t>
+      </w:r>
+      <w:proofErr w:type="spellStart"/>
+      <w:proofErr w:type="gramStart"/>
+      <w:r>
+        <w:rPr>
+          <w:rStyle w:val="Kpr"/>
+          <w:sz w:val="20"/>
+          <w:szCs w:val="20"/>
+        </w:rPr>
+        <w:t>LeetCode</w:t>
+      </w:r>
+      <w:proofErr w:type="spellEnd"/>
+      <w:r>
+        <w:rPr>
+          <w:rStyle w:val="Kpr"/>
+          <w:sz w:val="20"/>
+          <w:szCs w:val="20"/>
+        </w:rPr>
+        <w:t xml:space="preserve">  </w:t>
+      </w:r>
+      <w:r>
+        <w:rPr>
+          <w:rStyle w:val="Kpr"/>
+          <w:b/>
+          <w:bCs/>
+          <w:sz w:val="22"/>
+          <w:szCs w:val="22"/>
+        </w:rPr>
+        <w:t>342.</w:t>
+      </w:r>
+      <w:proofErr w:type="gramEnd"/>
+      <w:r>
+        <w:rPr>
+          <w:rStyle w:val="Kpr"/>
+          <w:b/>
+          <w:bCs/>
+          <w:sz w:val="22"/>
+          <w:szCs w:val="22"/>
+        </w:rPr>
+        <w:t xml:space="preserve"> </w:t>
+      </w:r>
+      <w:proofErr w:type="spellStart"/>
+      <w:r>
+        <w:rPr>
+          <w:rStyle w:val="Kpr"/>
+          <w:b/>
+          <w:bCs/>
+          <w:sz w:val="22"/>
+          <w:szCs w:val="22"/>
+        </w:rPr>
+        <w:t>Power</w:t>
+      </w:r>
+      <w:proofErr w:type="spellEnd"/>
+      <w:r>
+        <w:rPr>
+          <w:rStyle w:val="Kpr"/>
+          <w:b/>
+          <w:bCs/>
+          <w:sz w:val="22"/>
+          <w:szCs w:val="22"/>
+        </w:rPr>
+        <w:t xml:space="preserve"> of </w:t>
+      </w:r>
+      <w:proofErr w:type="spellStart"/>
+      <w:r>
+        <w:rPr>
+          <w:rStyle w:val="Kpr"/>
+          <w:b/>
+          <w:bCs/>
+          <w:sz w:val="22"/>
+          <w:szCs w:val="22"/>
+        </w:rPr>
+        <w:t>Four</w:t>
+      </w:r>
+      <w:proofErr w:type="spellEnd"/>
+      <w:r>
+        <w:rPr>
+          <w:rStyle w:val="Kpr"/>
+          <w:sz w:val="22"/>
+          <w:szCs w:val="22"/>
+        </w:rPr>
+        <w:t>(</w:t>
+      </w:r>
+      <w:proofErr w:type="spellStart"/>
+      <w:r>
+        <w:rPr>
+          <w:rStyle w:val="Kpr"/>
+          <w:sz w:val="22"/>
+          <w:szCs w:val="22"/>
+        </w:rPr>
+        <w:t>easy</w:t>
+      </w:r>
+      <w:proofErr w:type="spellEnd"/>
+      <w:r>
+        <w:rPr>
+          <w:rStyle w:val="Kpr"/>
+          <w:sz w:val="22"/>
+          <w:szCs w:val="22"/>
+        </w:rPr>
+        <w:t>)</w:t>
+      </w:r>
+    </w:p>
+    <w:p>
+      <w:pPr>
+        <w:pStyle w:val="Balk1"/>
+        <w:spacing w:before="300" w:after="150"/>
+        <w:rPr>
+          <w:color w:val="0D0D0D" w:themeColor="text1" w:themeTint="F2"/>
+          <w:sz w:val="22"/>
+          <w:szCs w:val="22"/>
+        </w:rPr>
+      </w:pPr>
+      <w:r>
+        <w:rPr>
+          <w:color w:val="0D0D0D" w:themeColor="text1" w:themeTint="F2"/>
+          <w:sz w:val="22"/>
+          <w:szCs w:val="22"/>
+        </w:rPr>
+        <w:fldChar w:fldCharType="end"/>
+      </w:r>
+      <w:r>
+        <w:rPr>
+          <w:sz w:val="24"/>
+          <w:szCs w:val="24"/>
+        </w:rPr>
+        <w:t xml:space="preserve"> </w:t>
+      </w:r>
+      <w:r>
+        <w:rPr>
+          <w:color w:val="0D0D0D" w:themeColor="text1" w:themeTint="F2"/>
+          <w:sz w:val="22"/>
+          <w:szCs w:val="22"/>
+        </w:rPr>
+        <w:t xml:space="preserve">Bu problemde bir sayının 4’ün kuvveti olup olmadığı </w:t>
+      </w:r>
+      <w:proofErr w:type="spellStart"/>
+      <w:r>
+        <w:rPr>
+          <w:color w:val="0D0D0D" w:themeColor="text1" w:themeTint="F2"/>
+          <w:sz w:val="22"/>
+          <w:szCs w:val="22"/>
+        </w:rPr>
+        <w:t>recursion</w:t>
+      </w:r>
+      <w:proofErr w:type="spellEnd"/>
+      <w:r>
+        <w:rPr>
+          <w:color w:val="0D0D0D" w:themeColor="text1" w:themeTint="F2"/>
+          <w:sz w:val="22"/>
+          <w:szCs w:val="22"/>
+        </w:rPr>
+        <w:t xml:space="preserve"> kullanılarak kontrol edi</w:t>
+      </w:r>
+      <w:r>
+        <w:rPr>
+          <w:color w:val="0D0D0D" w:themeColor="text1" w:themeTint="F2"/>
+          <w:sz w:val="22"/>
+          <w:szCs w:val="22"/>
+        </w:rPr>
+        <w:t>yoruz</w:t>
+      </w:r>
+      <w:r>
+        <w:rPr>
+          <w:color w:val="0D0D0D" w:themeColor="text1" w:themeTint="F2"/>
+          <w:sz w:val="22"/>
+          <w:szCs w:val="22"/>
+        </w:rPr>
+        <w:t>. Sayı 1 olduğunda işlem tamamlanır ve True döndürülür</w:t>
+      </w:r>
+      <w:r>
+        <w:rPr>
+          <w:color w:val="0D0D0D" w:themeColor="text1" w:themeTint="F2"/>
+          <w:sz w:val="22"/>
+          <w:szCs w:val="22"/>
+        </w:rPr>
+        <w:t>.</w:t>
+      </w:r>
+      <w:r>
+        <w:rPr>
+          <w:color w:val="0D0D0D" w:themeColor="text1" w:themeTint="F2"/>
+          <w:sz w:val="22"/>
+          <w:szCs w:val="22"/>
+        </w:rPr>
+        <w:t xml:space="preserve"> </w:t>
+      </w:r>
+      <w:r>
+        <w:rPr>
+          <w:color w:val="0D0D0D" w:themeColor="text1" w:themeTint="F2"/>
+          <w:sz w:val="22"/>
+          <w:szCs w:val="22"/>
+        </w:rPr>
+        <w:t>S</w:t>
+      </w:r>
+      <w:r>
+        <w:rPr>
+          <w:color w:val="0D0D0D" w:themeColor="text1" w:themeTint="F2"/>
+          <w:sz w:val="22"/>
+          <w:szCs w:val="22"/>
+        </w:rPr>
+        <w:t>ayı 4’e tam bölünmüyorsa veya 0’dan küçük</w:t>
+      </w:r>
+      <w:r>
+        <w:rPr>
+          <w:color w:val="0D0D0D" w:themeColor="text1" w:themeTint="F2"/>
+          <w:sz w:val="22"/>
+          <w:szCs w:val="22"/>
+        </w:rPr>
+        <w:t xml:space="preserve"> </w:t>
+      </w:r>
+      <w:r>
+        <w:rPr>
+          <w:color w:val="0D0D0D" w:themeColor="text1" w:themeTint="F2"/>
+          <w:sz w:val="22"/>
+          <w:szCs w:val="22"/>
+        </w:rPr>
+        <w:t xml:space="preserve">eşitse </w:t>
+      </w:r>
+      <w:proofErr w:type="spellStart"/>
+      <w:r>
+        <w:rPr>
+          <w:color w:val="0D0D0D" w:themeColor="text1" w:themeTint="F2"/>
+          <w:sz w:val="22"/>
+          <w:szCs w:val="22"/>
+        </w:rPr>
+        <w:t>False</w:t>
+      </w:r>
+      <w:proofErr w:type="spellEnd"/>
+      <w:r>
+        <w:rPr>
+          <w:color w:val="0D0D0D" w:themeColor="text1" w:themeTint="F2"/>
+          <w:sz w:val="22"/>
+          <w:szCs w:val="22"/>
+        </w:rPr>
+        <w:t xml:space="preserve"> döndürülür. Diğer durumlarda sayı 4’e bölünerek fonksiyon kendisini tekrar çağırır. Her adımda sayı 4’e bölündüğü için zaman karmaşıklığı </w:t>
+      </w:r>
+      <w:proofErr w:type="gramStart"/>
+      <w:r>
+        <w:rPr>
+          <w:b/>
+          <w:bCs/>
+          <w:color w:val="0D0D0D" w:themeColor="text1" w:themeTint="F2"/>
+          <w:sz w:val="22"/>
+          <w:szCs w:val="22"/>
+        </w:rPr>
+        <w:t>O(</w:t>
+      </w:r>
+      <w:proofErr w:type="gramEnd"/>
+      <w:r>
+        <w:rPr>
+          <w:b/>
+          <w:bCs/>
+          <w:color w:val="0D0D0D" w:themeColor="text1" w:themeTint="F2"/>
+          <w:sz w:val="22"/>
+          <w:szCs w:val="22"/>
+        </w:rPr>
+        <w:t>log n)</w:t>
+      </w:r>
+      <w:r>
+        <w:rPr>
+          <w:color w:val="0D0D0D" w:themeColor="text1" w:themeTint="F2"/>
+          <w:sz w:val="22"/>
+          <w:szCs w:val="22"/>
+        </w:rPr>
+        <w:t xml:space="preserve">, </w:t>
+      </w:r>
+      <w:proofErr w:type="spellStart"/>
+      <w:r>
+        <w:rPr>
+          <w:color w:val="0D0D0D" w:themeColor="text1" w:themeTint="F2"/>
+          <w:sz w:val="22"/>
+          <w:szCs w:val="22"/>
+        </w:rPr>
+        <w:t>recursion</w:t>
+      </w:r>
+      <w:proofErr w:type="spellEnd"/>
+      <w:r>
+        <w:rPr>
+          <w:color w:val="0D0D0D" w:themeColor="text1" w:themeTint="F2"/>
+          <w:sz w:val="22"/>
+          <w:szCs w:val="22"/>
+        </w:rPr>
+        <w:t xml:space="preserve"> çağrılarından dolayı alan karmaşıklığı </w:t>
+      </w:r>
+      <w:proofErr w:type="gramStart"/>
+      <w:r>
+        <w:rPr>
+          <w:b/>
+          <w:bCs/>
+          <w:color w:val="0D0D0D" w:themeColor="text1" w:themeTint="F2"/>
+          <w:sz w:val="22"/>
+          <w:szCs w:val="22"/>
+        </w:rPr>
+        <w:t>O(</w:t>
+      </w:r>
+      <w:proofErr w:type="gramEnd"/>
+      <w:r>
+        <w:rPr>
+          <w:b/>
+          <w:bCs/>
+          <w:color w:val="0D0D0D" w:themeColor="text1" w:themeTint="F2"/>
+          <w:sz w:val="22"/>
+          <w:szCs w:val="22"/>
+        </w:rPr>
+        <w:t>log n)</w:t>
+      </w:r>
+      <w:r>
+        <w:rPr>
+          <w:color w:val="0D0D0D" w:themeColor="text1" w:themeTint="F2"/>
+          <w:sz w:val="22"/>
+          <w:szCs w:val="22"/>
+        </w:rPr>
+        <w:t>’</w:t>
+      </w:r>
+      <w:proofErr w:type="spellStart"/>
+      <w:r>
+        <w:rPr>
+          <w:color w:val="0D0D0D" w:themeColor="text1" w:themeTint="F2"/>
+          <w:sz w:val="22"/>
+          <w:szCs w:val="22"/>
+        </w:rPr>
+        <w:t>dir</w:t>
+      </w:r>
+      <w:proofErr w:type="spellEnd"/>
+      <w:r>
+        <w:rPr>
+          <w:color w:val="0D0D0D" w:themeColor="text1" w:themeTint="F2"/>
+          <w:sz w:val="22"/>
+          <w:szCs w:val="22"/>
+        </w:rPr>
+        <w:t>.</w:t>
+      </w:r>
+    </w:p>
+    <w:p>
+      <w:pPr>
+        <w:pStyle w:val="Balk1"/>
+        <w:spacing w:before="300" w:after="150"/>
+        <w:rPr>
+          <w:color w:val="0D0D0D" w:themeColor="text1" w:themeTint="F2"/>
+          <w:sz w:val="22"/>
+          <w:szCs w:val="22"/>
+        </w:rPr>
+      </w:pPr>
+    </w:p>
+    <w:p>
+      <w:pPr>
+        <w:pStyle w:val="Balk1"/>
+        <w:spacing w:before="300" w:after="150"/>
+        <w:rPr>
+          <w:color w:val="0D0D0D" w:themeColor="text1" w:themeTint="F2"/>
+          <w:sz w:val="22"/>
+          <w:szCs w:val="22"/>
+        </w:rPr>
+      </w:pPr>
+    </w:p>
+    <w:p>
+      <w:pPr>
+        <w:pStyle w:val="Balk1"/>
+        <w:spacing w:before="300" w:after="150"/>
+        <w:rPr>
+          <w:color w:val="0D0D0D" w:themeColor="text1" w:themeTint="F2"/>
+        </w:rPr>
+      </w:pPr>
+      <w:r>
+        <w:rPr>
+          <w:color w:val="0D0D0D" w:themeColor="text1" w:themeTint="F2"/>
+        </w:rPr>
+        <w:t>4</w:t>
+      </w:r>
+      <w:r>
+        <w:rPr>
+          <w:color w:val="0D0D0D" w:themeColor="text1" w:themeTint="F2"/>
+        </w:rPr>
+        <w:t>. Teknik Kaynak Özeti</w:t>
+      </w:r>
+    </w:p>
+    <w:p>
+      <w:pPr>
+        <w:pStyle w:val="Balk1"/>
+        <w:spacing w:before="300" w:after="150"/>
+        <w:rPr>
+          <w:color w:val="0D0D0D" w:themeColor="text1" w:themeTint="F2"/>
+        </w:rPr>
+      </w:pPr>
+      <w:r>
+        <w:rPr>
+          <w:color w:val="0D0D0D" w:themeColor="text1" w:themeTint="F2"/>
+        </w:rPr>
+        <w:t>5</w:t>
+      </w:r>
+      <w:r>
+        <w:rPr>
+          <w:color w:val="0D0D0D" w:themeColor="text1" w:themeTint="F2"/>
+        </w:rPr>
+        <w:t>. Uyku Takip Tablosu</w:t>
       </w:r>
     </w:p>
     <w:tbl>
@@ -935,12 +4415,6 @@
         <w:gridCol w:w="2340"/>
       </w:tblGrid>
       <w:tr>
-        <w:tblPrEx>
-          <w:tblCellMar>
-            <w:top w:w="0" w:type="dxa"/>
-            <w:bottom w:w="0" w:type="dxa"/>
-          </w:tblCellMar>
-        </w:tblPrEx>
         <w:tc>
           <w:tcPr>
             <w:tcW w:w="2340" w:type="dxa"/>
@@ -958,6 +4432,7 @@
                 <w:bCs/>
                 <w:color w:val="0D0D0D" w:themeColor="text1" w:themeTint="F2"/>
               </w:rPr>
+              <w:lastRenderedPageBreak/>
               <w:t>Günler</w:t>
             </w:r>
           </w:p>
@@ -1027,12 +4502,6 @@
         </w:tc>
       </w:tr>
       <w:tr>
-        <w:tblPrEx>
-          <w:tblCellMar>
-            <w:top w:w="0" w:type="dxa"/>
-            <w:bottom w:w="0" w:type="dxa"/>
-          </w:tblCellMar>
-        </w:tblPrEx>
         <w:tc>
           <w:tcPr>
             <w:tcW w:w="2340" w:type="dxa"/>
@@ -1061,6 +4530,12 @@
                 <w:color w:val="0D0D0D" w:themeColor="text1" w:themeTint="F2"/>
               </w:rPr>
             </w:pPr>
+            <w:r>
+              <w:rPr>
+                <w:color w:val="0D0D0D" w:themeColor="text1" w:themeTint="F2"/>
+              </w:rPr>
+              <w:t>24.00</w:t>
+            </w:r>
           </w:p>
         </w:tc>
         <w:tc>
@@ -1073,6 +4548,12 @@
                 <w:color w:val="0D0D0D" w:themeColor="text1" w:themeTint="F2"/>
               </w:rPr>
             </w:pPr>
+            <w:r>
+              <w:rPr>
+                <w:color w:val="0D0D0D" w:themeColor="text1" w:themeTint="F2"/>
+              </w:rPr>
+              <w:t>8.30</w:t>
+            </w:r>
           </w:p>
         </w:tc>
         <w:tc>
@@ -1085,16 +4566,16 @@
                 <w:color w:val="0D0D0D" w:themeColor="text1" w:themeTint="F2"/>
               </w:rPr>
             </w:pPr>
+            <w:r>
+              <w:rPr>
+                <w:color w:val="0D0D0D" w:themeColor="text1" w:themeTint="F2"/>
+              </w:rPr>
+              <w:t>8.30</w:t>
+            </w:r>
           </w:p>
         </w:tc>
       </w:tr>
       <w:tr>
-        <w:tblPrEx>
-          <w:tblCellMar>
-            <w:top w:w="0" w:type="dxa"/>
-            <w:bottom w:w="0" w:type="dxa"/>
-          </w:tblCellMar>
-        </w:tblPrEx>
         <w:tc>
           <w:tcPr>
             <w:tcW w:w="2340" w:type="dxa"/>
@@ -1123,6 +4604,12 @@
                 <w:color w:val="0D0D0D" w:themeColor="text1" w:themeTint="F2"/>
               </w:rPr>
             </w:pPr>
+            <w:r>
+              <w:rPr>
+                <w:color w:val="0D0D0D" w:themeColor="text1" w:themeTint="F2"/>
+              </w:rPr>
+              <w:t>23.45</w:t>
+            </w:r>
           </w:p>
         </w:tc>
         <w:tc>
@@ -1135,6 +4622,12 @@
                 <w:color w:val="0D0D0D" w:themeColor="text1" w:themeTint="F2"/>
               </w:rPr>
             </w:pPr>
+            <w:r>
+              <w:rPr>
+                <w:color w:val="0D0D0D" w:themeColor="text1" w:themeTint="F2"/>
+              </w:rPr>
+              <w:t>8.00</w:t>
+            </w:r>
           </w:p>
         </w:tc>
         <w:tc>
@@ -1147,16 +4640,16 @@
                 <w:color w:val="0D0D0D" w:themeColor="text1" w:themeTint="F2"/>
               </w:rPr>
             </w:pPr>
+            <w:r>
+              <w:rPr>
+                <w:color w:val="0D0D0D" w:themeColor="text1" w:themeTint="F2"/>
+              </w:rPr>
+              <w:t>8.15</w:t>
+            </w:r>
           </w:p>
         </w:tc>
       </w:tr>
       <w:tr>
-        <w:tblPrEx>
-          <w:tblCellMar>
-            <w:top w:w="0" w:type="dxa"/>
-            <w:bottom w:w="0" w:type="dxa"/>
-          </w:tblCellMar>
-        </w:tblPrEx>
         <w:tc>
           <w:tcPr>
             <w:tcW w:w="2340" w:type="dxa"/>
@@ -1185,6 +4678,12 @@
                 <w:color w:val="0D0D0D" w:themeColor="text1" w:themeTint="F2"/>
               </w:rPr>
             </w:pPr>
+            <w:r>
+              <w:rPr>
+                <w:color w:val="0D0D0D" w:themeColor="text1" w:themeTint="F2"/>
+              </w:rPr>
+              <w:t>23.30</w:t>
+            </w:r>
           </w:p>
         </w:tc>
         <w:tc>
@@ -1197,6 +4696,12 @@
                 <w:color w:val="0D0D0D" w:themeColor="text1" w:themeTint="F2"/>
               </w:rPr>
             </w:pPr>
+            <w:r>
+              <w:rPr>
+                <w:color w:val="0D0D0D" w:themeColor="text1" w:themeTint="F2"/>
+              </w:rPr>
+              <w:t>7.45</w:t>
+            </w:r>
           </w:p>
         </w:tc>
         <w:tc>
@@ -1209,16 +4714,16 @@
                 <w:color w:val="0D0D0D" w:themeColor="text1" w:themeTint="F2"/>
               </w:rPr>
             </w:pPr>
+            <w:r>
+              <w:rPr>
+                <w:color w:val="0D0D0D" w:themeColor="text1" w:themeTint="F2"/>
+              </w:rPr>
+              <w:t>8.15</w:t>
+            </w:r>
           </w:p>
         </w:tc>
       </w:tr>
       <w:tr>
-        <w:tblPrEx>
-          <w:tblCellMar>
-            <w:top w:w="0" w:type="dxa"/>
-            <w:bottom w:w="0" w:type="dxa"/>
-          </w:tblCellMar>
-        </w:tblPrEx>
         <w:tc>
           <w:tcPr>
             <w:tcW w:w="2340" w:type="dxa"/>
@@ -1247,6 +4752,12 @@
                 <w:color w:val="0D0D0D" w:themeColor="text1" w:themeTint="F2"/>
               </w:rPr>
             </w:pPr>
+            <w:r>
+              <w:rPr>
+                <w:color w:val="0D0D0D" w:themeColor="text1" w:themeTint="F2"/>
+              </w:rPr>
+              <w:t>22.00</w:t>
+            </w:r>
           </w:p>
         </w:tc>
         <w:tc>
@@ -1259,6 +4770,12 @@
                 <w:color w:val="0D0D0D" w:themeColor="text1" w:themeTint="F2"/>
               </w:rPr>
             </w:pPr>
+            <w:r>
+              <w:rPr>
+                <w:color w:val="0D0D0D" w:themeColor="text1" w:themeTint="F2"/>
+              </w:rPr>
+              <w:t>6.00</w:t>
+            </w:r>
           </w:p>
         </w:tc>
         <w:tc>
@@ -1271,16 +4788,16 @@
                 <w:color w:val="0D0D0D" w:themeColor="text1" w:themeTint="F2"/>
               </w:rPr>
             </w:pPr>
+            <w:r>
+              <w:rPr>
+                <w:color w:val="0D0D0D" w:themeColor="text1" w:themeTint="F2"/>
+              </w:rPr>
+              <w:t>8.00</w:t>
+            </w:r>
           </w:p>
         </w:tc>
       </w:tr>
       <w:tr>
-        <w:tblPrEx>
-          <w:tblCellMar>
-            <w:top w:w="0" w:type="dxa"/>
-            <w:bottom w:w="0" w:type="dxa"/>
-          </w:tblCellMar>
-        </w:tblPrEx>
         <w:tc>
           <w:tcPr>
             <w:tcW w:w="2340" w:type="dxa"/>
@@ -1309,6 +4826,12 @@
                 <w:color w:val="0D0D0D" w:themeColor="text1" w:themeTint="F2"/>
               </w:rPr>
             </w:pPr>
+            <w:r>
+              <w:rPr>
+                <w:color w:val="0D0D0D" w:themeColor="text1" w:themeTint="F2"/>
+              </w:rPr>
+              <w:t>23.30</w:t>
+            </w:r>
           </w:p>
         </w:tc>
         <w:tc>
@@ -1321,6 +4844,12 @@
                 <w:color w:val="0D0D0D" w:themeColor="text1" w:themeTint="F2"/>
               </w:rPr>
             </w:pPr>
+            <w:r>
+              <w:rPr>
+                <w:color w:val="0D0D0D" w:themeColor="text1" w:themeTint="F2"/>
+              </w:rPr>
+              <w:t>8.30</w:t>
+            </w:r>
           </w:p>
         </w:tc>
         <w:tc>
@@ -1333,16 +4862,16 @@
                 <w:color w:val="0D0D0D" w:themeColor="text1" w:themeTint="F2"/>
               </w:rPr>
             </w:pPr>
+            <w:r>
+              <w:rPr>
+                <w:color w:val="0D0D0D" w:themeColor="text1" w:themeTint="F2"/>
+              </w:rPr>
+              <w:t>9.00</w:t>
+            </w:r>
           </w:p>
         </w:tc>
       </w:tr>
       <w:tr>
-        <w:tblPrEx>
-          <w:tblCellMar>
-            <w:top w:w="0" w:type="dxa"/>
-            <w:bottom w:w="0" w:type="dxa"/>
-          </w:tblCellMar>
-        </w:tblPrEx>
         <w:tc>
           <w:tcPr>
             <w:tcW w:w="2340" w:type="dxa"/>
@@ -1399,12 +4928,6 @@
         </w:tc>
       </w:tr>
       <w:tr>
-        <w:tblPrEx>
-          <w:tblCellMar>
-            <w:top w:w="0" w:type="dxa"/>
-            <w:bottom w:w="0" w:type="dxa"/>
-          </w:tblCellMar>
-        </w:tblPrEx>
         <w:tc>
           <w:tcPr>
             <w:tcW w:w="2340" w:type="dxa"/>
@@ -1481,7 +5004,13 @@
         <w:rPr>
           <w:color w:val="0D0D0D" w:themeColor="text1" w:themeTint="F2"/>
         </w:rPr>
-        <w:t>5. Nerede Zorlandım ve Takıldım</w:t>
+        <w:t>6</w:t>
+      </w:r>
+      <w:r>
+        <w:rPr>
+          <w:color w:val="0D0D0D" w:themeColor="text1" w:themeTint="F2"/>
+        </w:rPr>
+        <w:t>. Nerede Zorlandım ve Takıldım</w:t>
       </w:r>
     </w:p>
     <w:p>
@@ -1496,8 +5025,13 @@
         <w:rPr>
           <w:color w:val="0D0D0D" w:themeColor="text1" w:themeTint="F2"/>
         </w:rPr>
-        <w:lastRenderedPageBreak/>
-        <w:t>6. Haftalık Genel Değerlendirme</w:t>
+        <w:t>7</w:t>
+      </w:r>
+      <w:r>
+        <w:rPr>
+          <w:color w:val="0D0D0D" w:themeColor="text1" w:themeTint="F2"/>
+        </w:rPr>
+        <w:t>. Haftalık Genel Değerlendirme</w:t>
       </w:r>
     </w:p>
     <w:p>
@@ -2241,6 +5775,30 @@
       <w:shd w:val="clear" w:color="auto" w:fill="E1DFDD"/>
     </w:rPr>
   </w:style>
+  <w:style w:type="character" w:styleId="zlenenKpr">
+    <w:name w:val="FollowedHyperlink"/>
+    <w:basedOn w:val="VarsaylanParagrafYazTipi"/>
+    <w:uiPriority w:val="99"/>
+    <w:semiHidden/>
+    <w:unhideWhenUsed/>
+    <w:rsid w:val="00D70433"/>
+    <w:rPr>
+      <w:color w:val="954F72" w:themeColor="followedHyperlink"/>
+      <w:u w:val="single"/>
+    </w:rPr>
+  </w:style>
+  <w:style w:type="paragraph" w:styleId="NormalWeb">
+    <w:name w:val="Normal (Web)"/>
+    <w:basedOn w:val="Normal"/>
+    <w:uiPriority w:val="99"/>
+    <w:semiHidden/>
+    <w:unhideWhenUsed/>
+    <w:rsid w:val="001B2ADF"/>
+    <w:rPr>
+      <w:sz w:val="24"/>
+      <w:szCs w:val="24"/>
+    </w:rPr>
+  </w:style>
 </w:styles>
 </file>
 

</xml_diff>